<commit_message>
Complete communication and certificate lists
Co-authored-by: arena-agent <297053741+arena-agent@users.noreply.github.com>
</commit_message>
<xml_diff>
--- a/Liste communications .docx
+++ b/Liste communications .docx
@@ -1119,6 +1119,386 @@
         </w:sdtContent>
       </w:sdt>
     </w:p>
+    <w:p>
+      <w:pPr>
+        <w:suppressAutoHyphens/>
+        <w:spacing w:line="240" w:lineRule="auto"/>
+        <w:ind w:right="146" w:firstLine="0"/>
+        <w:rPr>
+          <w:b/>
+          <w:color w:val="000000"/>
+          <w:spacing w:val="-1"/>
+          <w:sz w:val="26"/>
+          <w:szCs w:val="26"/>
+          <w:u w:val="single"/>
+        </w:rPr>
+      </w:pPr>
+    </w:p>
+    <w:p>
+      <w:pPr>
+        <w:spacing w:line="240" w:lineRule="auto"/>
+        <w:ind w:firstLine="0"/>
+        <w:jc w:val="left"/>
+        <w:rPr>
+          <w:iCs/>
+          <w:sz w:val="26"/>
+          <w:szCs w:val="26"/>
+        </w:rPr>
+      </w:pPr>
+      <w:r>
+        <w:rPr>
+          <w:sz w:val="26"/>
+        </w:rPr>
+        <w:t>Auteurs : Azandjeme Colette Sylvie, LEGBA S. Rosine, AGUEMON Badirou, Sopoh Ghislain, Sossa Charles, Ouendo Edgard-Marius</w:t>
+      </w:r>
+    </w:p>
+    <w:p>
+      <w:pPr>
+        <w:spacing w:line="240" w:lineRule="auto"/>
+        <w:ind w:firstLine="0"/>
+        <w:jc w:val="left"/>
+        <w:rPr>
+          <w:iCs/>
+          <w:sz w:val="26"/>
+          <w:szCs w:val="26"/>
+        </w:rPr>
+      </w:pPr>
+      <w:r>
+        <w:rPr>
+          <w:sz w:val="26"/>
+        </w:rPr>
+        <w:t>Titre de la communication : Usage des appareils électroniques audiovisuels par les adolescents de 10 à 19 ans dans la commune d’Abomey Calavi en 2021 : connaissances, attitudes et pratiques, et conséquences socio sanitaires associées</w:t>
+      </w:r>
+    </w:p>
+    <w:p>
+      <w:pPr>
+        <w:spacing w:line="240" w:lineRule="auto"/>
+        <w:ind w:firstLine="0"/>
+        <w:jc w:val="left"/>
+        <w:rPr>
+          <w:b/>
+          <w:bCs/>
+          <w:i/>
+          <w:iCs/>
+          <w:sz w:val="26"/>
+          <w:szCs w:val="26"/>
+        </w:rPr>
+      </w:pPr>
+      <w:r>
+        <w:rPr>
+          <w:i/>
+          <w:sz w:val="26"/>
+        </w:rPr>
+        <w:t>In : Livre des résumés, 2ème Congrès Burkinabè de Santé Publique (code STH-5-S10-COL-120, Ouagadougou, Burkina Faso, 16 au 18 décembre 2021, p. 202–203)</w:t>
+      </w:r>
+    </w:p>
+    <w:p>
+      <w:pPr>
+        <w:suppressAutoHyphens/>
+        <w:spacing w:line="240" w:lineRule="auto"/>
+        <w:ind w:right="146" w:firstLine="0"/>
+        <w:rPr>
+          <w:b/>
+          <w:color w:val="000000"/>
+          <w:spacing w:val="-1"/>
+          <w:sz w:val="26"/>
+          <w:szCs w:val="26"/>
+          <w:u w:val="single"/>
+        </w:rPr>
+      </w:pPr>
+    </w:p>
+    <w:p>
+      <w:pPr>
+        <w:spacing w:line="240" w:lineRule="auto"/>
+        <w:ind w:firstLine="0"/>
+        <w:jc w:val="left"/>
+        <w:rPr>
+          <w:iCs/>
+          <w:sz w:val="26"/>
+          <w:szCs w:val="26"/>
+        </w:rPr>
+      </w:pPr>
+      <w:r>
+        <w:rPr>
+          <w:sz w:val="26"/>
+        </w:rPr>
+        <w:t>Auteurs : Azandjeme Colette Sylvie, Danmadou Oceane, Metonnou Clemence, Sossa Charles, Kpozehouen Alphonse, Paraiso Moussiliou, Ouendo Edgard-Marius</w:t>
+      </w:r>
+    </w:p>
+    <w:p>
+      <w:pPr>
+        <w:spacing w:line="240" w:lineRule="auto"/>
+        <w:ind w:firstLine="0"/>
+        <w:jc w:val="left"/>
+        <w:rPr>
+          <w:iCs/>
+          <w:sz w:val="26"/>
+          <w:szCs w:val="26"/>
+        </w:rPr>
+      </w:pPr>
+      <w:r>
+        <w:rPr>
+          <w:sz w:val="26"/>
+        </w:rPr>
+        <w:t>Titre de la communication : Evaluation de l’efficacité du projet « stratégie de réduction de la consommation du sel dans la commune de Porto-Novo »</w:t>
+      </w:r>
+    </w:p>
+    <w:p>
+      <w:pPr>
+        <w:spacing w:line="240" w:lineRule="auto"/>
+        <w:ind w:firstLine="0"/>
+        <w:jc w:val="left"/>
+        <w:rPr>
+          <w:b/>
+          <w:bCs/>
+          <w:i/>
+          <w:iCs/>
+          <w:sz w:val="26"/>
+          <w:szCs w:val="26"/>
+        </w:rPr>
+      </w:pPr>
+      <w:r>
+        <w:rPr>
+          <w:i/>
+          <w:sz w:val="26"/>
+        </w:rPr>
+        <w:t>In : Livre des résumés, 2ème Congrès Burkinabè de Santé Publique (code STH-5-S11-COL-121, Ouagadougou, Burkina Faso, 16 au 18 décembre 2021, p. 203)</w:t>
+      </w:r>
+    </w:p>
+    <w:p>
+      <w:pPr>
+        <w:suppressAutoHyphens/>
+        <w:spacing w:line="240" w:lineRule="auto"/>
+        <w:ind w:right="146" w:firstLine="0"/>
+        <w:rPr>
+          <w:b/>
+          <w:color w:val="000000"/>
+          <w:spacing w:val="-1"/>
+          <w:sz w:val="26"/>
+          <w:szCs w:val="26"/>
+          <w:u w:val="single"/>
+        </w:rPr>
+      </w:pPr>
+    </w:p>
+    <w:p>
+      <w:pPr>
+        <w:spacing w:line="240" w:lineRule="auto"/>
+        <w:ind w:firstLine="0"/>
+        <w:jc w:val="left"/>
+        <w:rPr>
+          <w:iCs/>
+          <w:sz w:val="26"/>
+          <w:szCs w:val="26"/>
+        </w:rPr>
+      </w:pPr>
+      <w:r>
+        <w:rPr>
+          <w:sz w:val="26"/>
+        </w:rPr>
+        <w:t>Auteurs : Sossa Charles, Munezero Florence, Ahanhanzo Glele Yolaine, Azandjeme Colette, Paraïso Moussiliou, Bazira Léodégal</w:t>
+      </w:r>
+    </w:p>
+    <w:p>
+      <w:pPr>
+        <w:spacing w:line="240" w:lineRule="auto"/>
+        <w:ind w:firstLine="0"/>
+        <w:jc w:val="left"/>
+        <w:rPr>
+          <w:iCs/>
+          <w:sz w:val="26"/>
+          <w:szCs w:val="26"/>
+        </w:rPr>
+      </w:pPr>
+      <w:r>
+        <w:rPr>
+          <w:sz w:val="26"/>
+        </w:rPr>
+        <w:t>Titre de la communication : Facteurs associés à satisfaction des prestataires sur le système d’information sanitaire basé des dossiers médicaux électroniques dans des hôpitaux du Burundi</w:t>
+      </w:r>
+    </w:p>
+    <w:p>
+      <w:pPr>
+        <w:spacing w:line="240" w:lineRule="auto"/>
+        <w:ind w:firstLine="0"/>
+        <w:jc w:val="left"/>
+        <w:rPr>
+          <w:b/>
+          <w:bCs/>
+          <w:i/>
+          <w:iCs/>
+          <w:sz w:val="26"/>
+          <w:szCs w:val="26"/>
+        </w:rPr>
+      </w:pPr>
+      <w:r>
+        <w:rPr>
+          <w:i/>
+          <w:sz w:val="26"/>
+        </w:rPr>
+        <w:t>In : Livret des résumés – 1er Congrès de la SASP (code C154, Grand Bassam, Côte d’Ivoire, 15 au 17 novembre 2023, p. 168)</w:t>
+      </w:r>
+    </w:p>
+    <w:p>
+      <w:pPr>
+        <w:suppressAutoHyphens/>
+        <w:spacing w:line="240" w:lineRule="auto"/>
+        <w:ind w:right="146" w:firstLine="0"/>
+        <w:rPr>
+          <w:b/>
+          <w:color w:val="000000"/>
+          <w:spacing w:val="-1"/>
+          <w:sz w:val="26"/>
+          <w:szCs w:val="26"/>
+          <w:u w:val="single"/>
+        </w:rPr>
+      </w:pPr>
+    </w:p>
+    <w:p>
+      <w:pPr>
+        <w:spacing w:line="240" w:lineRule="auto"/>
+        <w:ind w:firstLine="0"/>
+        <w:jc w:val="left"/>
+        <w:rPr>
+          <w:iCs/>
+          <w:sz w:val="26"/>
+          <w:szCs w:val="26"/>
+        </w:rPr>
+      </w:pPr>
+      <w:r>
+        <w:rPr>
+          <w:sz w:val="26"/>
+        </w:rPr>
+        <w:t>Auteurs : Sossa Charles, Kpanou Fataï, Azandjeme Colette, Paraïso Moussiliou, Yemoa Achille</w:t>
+      </w:r>
+    </w:p>
+    <w:p>
+      <w:pPr>
+        <w:spacing w:line="240" w:lineRule="auto"/>
+        <w:ind w:firstLine="0"/>
+        <w:jc w:val="left"/>
+        <w:rPr>
+          <w:iCs/>
+          <w:sz w:val="26"/>
+          <w:szCs w:val="26"/>
+        </w:rPr>
+      </w:pPr>
+      <w:r>
+        <w:rPr>
+          <w:sz w:val="26"/>
+        </w:rPr>
+        <w:t>Titre de la communication : Bilan du contrôle de qualité des médicaments distribués par les programmes de lutte contre le sida, la tuberculose et le paludisme au Bénin</w:t>
+      </w:r>
+    </w:p>
+    <w:p>
+      <w:pPr>
+        <w:spacing w:line="240" w:lineRule="auto"/>
+        <w:ind w:firstLine="0"/>
+        <w:jc w:val="left"/>
+        <w:rPr>
+          <w:b/>
+          <w:bCs/>
+          <w:i/>
+          <w:iCs/>
+          <w:sz w:val="26"/>
+          <w:szCs w:val="26"/>
+        </w:rPr>
+      </w:pPr>
+      <w:r>
+        <w:rPr>
+          <w:i/>
+          <w:sz w:val="26"/>
+        </w:rPr>
+        <w:t>In : Livret des résumés – 1er Congrès de la SASP (code C155, Grand Bassam, Côte d’Ivoire, 15 au 17 novembre 2023, p. 169)</w:t>
+      </w:r>
+    </w:p>
+    <w:p>
+      <w:pPr>
+        <w:suppressAutoHyphens/>
+        <w:spacing w:line="240" w:lineRule="auto"/>
+        <w:ind w:right="146" w:firstLine="0"/>
+        <w:rPr>
+          <w:b/>
+          <w:color w:val="000000"/>
+          <w:spacing w:val="-1"/>
+          <w:sz w:val="26"/>
+          <w:szCs w:val="26"/>
+          <w:u w:val="single"/>
+        </w:rPr>
+      </w:pPr>
+    </w:p>
+    <w:p>
+      <w:pPr>
+        <w:spacing w:line="240" w:lineRule="auto"/>
+        <w:ind w:firstLine="0"/>
+        <w:jc w:val="left"/>
+        <w:rPr>
+          <w:iCs/>
+          <w:sz w:val="26"/>
+          <w:szCs w:val="26"/>
+        </w:rPr>
+      </w:pPr>
+      <w:r>
+        <w:rPr>
+          <w:sz w:val="26"/>
+        </w:rPr>
+        <w:t>Auteurs : Sossa Charles, Munezero Florence, Ahanhanzo Glele Yolaine, Azandjeme Colette, Paraïso Moussiliou, Bazira Léodégal</w:t>
+      </w:r>
+    </w:p>
+    <w:p>
+      <w:pPr>
+        <w:spacing w:line="240" w:lineRule="auto"/>
+        <w:ind w:firstLine="0"/>
+        <w:jc w:val="left"/>
+        <w:rPr>
+          <w:iCs/>
+          <w:sz w:val="26"/>
+          <w:szCs w:val="26"/>
+        </w:rPr>
+      </w:pPr>
+      <w:r>
+        <w:rPr>
+          <w:sz w:val="26"/>
+        </w:rPr>
+        <w:t>Titre de la communication : Apports de l’informatisation du dossier patient sur sa complétude dans des hôpitaux du Burundi</w:t>
+      </w:r>
+    </w:p>
+    <w:p>
+      <w:pPr>
+        <w:spacing w:line="240" w:lineRule="auto"/>
+        <w:ind w:firstLine="0"/>
+        <w:jc w:val="left"/>
+        <w:rPr>
+          <w:b/>
+          <w:bCs/>
+          <w:i/>
+          <w:iCs/>
+          <w:sz w:val="26"/>
+          <w:szCs w:val="26"/>
+        </w:rPr>
+      </w:pPr>
+      <w:r>
+        <w:rPr>
+          <w:i/>
+          <w:sz w:val="26"/>
+        </w:rPr>
+        <w:t>In : Livret des résumés – 1er Congrès de la SASP (code C158, Grand Bassam, Côte d’Ivoire, 15 au 17 novembre 2023, p. 172)</w:t>
+      </w:r>
+    </w:p>
+    <w:p>
+      <w:pPr>
+        <w:suppressAutoHyphens/>
+        <w:spacing w:line="240" w:lineRule="auto"/>
+        <w:ind w:right="146" w:firstLine="0"/>
+        <w:rPr>
+          <w:b/>
+          <w:color w:val="000000"/>
+          <w:spacing w:val="-1"/>
+          <w:sz w:val="26"/>
+          <w:szCs w:val="26"/>
+          <w:u w:val="single"/>
+        </w:rPr>
+      </w:pPr>
+    </w:p>
     <w:sdt>
       <w:sdtPr>
         <w:rPr>
@@ -1305,51 +1685,6 @@
           <w:u w:val="single"/>
         </w:rPr>
       </w:pPr>
-    </w:p>
-    <w:p>
-      <w:pPr>
-        <w:suppressAutoHyphens/>
-        <w:spacing w:line="240" w:lineRule="auto"/>
-        <w:ind w:right="146" w:firstLine="0"/>
-        <w:rPr>
-          <w:b/>
-          <w:color w:val="000000"/>
-          <w:spacing w:val="-1"/>
-          <w:sz w:val="26"/>
-          <w:szCs w:val="26"/>
-          <w:u w:val="single"/>
-        </w:rPr>
-      </w:pPr>
-    </w:p>
-    <w:p>
-      <w:pPr>
-        <w:suppressAutoHyphens/>
-        <w:spacing w:line="240" w:lineRule="auto"/>
-        <w:ind w:right="146" w:firstLine="0"/>
-        <w:rPr>
-          <w:b/>
-          <w:color w:val="000000"/>
-          <w:spacing w:val="-1"/>
-          <w:sz w:val="26"/>
-          <w:szCs w:val="26"/>
-          <w:u w:val="single"/>
-        </w:rPr>
-      </w:pPr>
-    </w:p>
-    <w:p>
-      <w:pPr>
-        <w:suppressAutoHyphens/>
-        <w:spacing w:line="240" w:lineRule="auto"/>
-        <w:ind w:right="146" w:firstLine="0"/>
-        <w:rPr>
-          <w:b/>
-          <w:color w:val="000000"/>
-          <w:spacing w:val="-1"/>
-          <w:sz w:val="26"/>
-          <w:szCs w:val="26"/>
-          <w:u w:val="single"/>
-        </w:rPr>
-      </w:pPr>
       <w:r>
         <w:rPr>
           <w:b/>
@@ -1425,45 +1760,1176 @@
           <w:szCs w:val="26"/>
         </w:rPr>
       </w:pPr>
-      <w:sdt>
-        <w:sdtPr>
-          <w:rPr>
-            <w:iCs/>
-            <w:sz w:val="26"/>
-            <w:szCs w:val="26"/>
-          </w:rPr>
-          <w:id w:val="250935032"/>
-          <w:placeholder>
-            <w:docPart w:val="5BFAF0CA0C243B4BB76985574AFD0F90"/>
-          </w:placeholder>
-        </w:sdtPr>
-        <w:sdtContent>
-          <w:r>
-            <w:rPr>
-              <w:iCs/>
-              <w:sz w:val="26"/>
-              <w:szCs w:val="26"/>
-            </w:rPr>
-            <w:t>Année</w:t>
-          </w:r>
-        </w:sdtContent>
-      </w:sdt>
-      <w:r>
-        <w:rPr>
-          <w:iCs/>
-          <w:sz w:val="26"/>
-          <w:szCs w:val="26"/>
-        </w:rPr>
-        <w:t> : 2021</w:t>
-      </w:r>
-      <w:r>
-        <w:rPr>
-          <w:iCs/>
-          <w:sz w:val="26"/>
-          <w:szCs w:val="26"/>
-        </w:rPr>
-        <w:tab/>
-      </w:r>
+      <w:r>
+        <w:rPr>
+          <w:sz w:val="26"/>
+        </w:rPr>
+        <w:t>Année : 2021</w:t>
+      </w:r>
+    </w:p>
+    <w:p>
+      <w:pPr>
+        <w:spacing w:line="240" w:lineRule="auto"/>
+        <w:ind w:firstLine="0"/>
+        <w:jc w:val="left"/>
+        <w:rPr>
+          <w:iCs/>
+          <w:sz w:val="26"/>
+          <w:szCs w:val="26"/>
+        </w:rPr>
+      </w:pPr>
+      <w:r>
+        <w:rPr>
+          <w:sz w:val="26"/>
+        </w:rPr>
+        <w:t>Auteur : AZANDJEME Colette Sylvie</w:t>
+      </w:r>
+    </w:p>
+    <w:p>
+      <w:pPr>
+        <w:spacing w:line="240" w:lineRule="auto"/>
+        <w:ind w:firstLine="0"/>
+        <w:jc w:val="left"/>
+        <w:rPr>
+          <w:iCs/>
+          <w:sz w:val="26"/>
+          <w:szCs w:val="26"/>
+        </w:rPr>
+      </w:pPr>
+      <w:r>
+        <w:rPr>
+          <w:sz w:val="26"/>
+        </w:rPr>
+        <w:t>Titre de la communication : Aliments de la rue à Cotonou : pratiques culinaires des vendeurs, qualité organoleptique et nutritionnelle des repas</w:t>
+      </w:r>
+    </w:p>
+    <w:p>
+      <w:pPr>
+        <w:spacing w:line="240" w:lineRule="auto"/>
+        <w:ind w:firstLine="0"/>
+        <w:jc w:val="left"/>
+        <w:rPr>
+          <w:b/>
+          <w:bCs/>
+          <w:i/>
+          <w:iCs/>
+          <w:sz w:val="26"/>
+          <w:szCs w:val="26"/>
+        </w:rPr>
+      </w:pPr>
+      <w:r>
+        <w:rPr>
+          <w:i/>
+          <w:sz w:val="26"/>
+        </w:rPr>
+        <w:t>In : 5ème édition des Journées Scientifiques du CAMES (Centre africain d’études supérieures en gestion (CESAG), Dakar (Sénégal), 06 au 09 décembre 2021)</w:t>
+      </w:r>
+    </w:p>
+    <w:p>
+      <w:pPr>
+        <w:suppressAutoHyphens/>
+        <w:spacing w:line="240" w:lineRule="auto"/>
+        <w:ind w:right="146" w:firstLine="0"/>
+        <w:rPr>
+          <w:b/>
+          <w:color w:val="000000"/>
+          <w:spacing w:val="-1"/>
+          <w:sz w:val="26"/>
+          <w:szCs w:val="26"/>
+          <w:u w:val="single"/>
+        </w:rPr>
+      </w:pPr>
+    </w:p>
+    <w:p>
+      <w:pPr>
+        <w:spacing w:line="240" w:lineRule="auto"/>
+        <w:ind w:firstLine="0"/>
+        <w:jc w:val="left"/>
+        <w:rPr>
+          <w:iCs/>
+          <w:sz w:val="26"/>
+          <w:szCs w:val="26"/>
+        </w:rPr>
+      </w:pPr>
+      <w:r>
+        <w:rPr>
+          <w:sz w:val="26"/>
+        </w:rPr>
+        <w:t>Auteur : AZANDJEME Colette Sylvie</w:t>
+      </w:r>
+    </w:p>
+    <w:p>
+      <w:pPr>
+        <w:spacing w:line="240" w:lineRule="auto"/>
+        <w:ind w:firstLine="0"/>
+        <w:jc w:val="left"/>
+        <w:rPr>
+          <w:iCs/>
+          <w:sz w:val="26"/>
+          <w:szCs w:val="26"/>
+        </w:rPr>
+      </w:pPr>
+      <w:r>
+        <w:rPr>
+          <w:sz w:val="26"/>
+        </w:rPr>
+        <w:t>Titre de la communication : Qualité de l’alimentation des enfants dans les orphelinats de la zone sanitaire Ouidah-Kpomassè-Tori Bossito en 2021</w:t>
+      </w:r>
+    </w:p>
+    <w:p>
+      <w:pPr>
+        <w:spacing w:line="240" w:lineRule="auto"/>
+        <w:ind w:firstLine="0"/>
+        <w:jc w:val="left"/>
+        <w:rPr>
+          <w:b/>
+          <w:bCs/>
+          <w:i/>
+          <w:iCs/>
+          <w:sz w:val="26"/>
+          <w:szCs w:val="26"/>
+        </w:rPr>
+      </w:pPr>
+      <w:r>
+        <w:rPr>
+          <w:i/>
+          <w:sz w:val="26"/>
+        </w:rPr>
+        <w:t>In : 5ème édition des Journées Scientifiques du CAMES (Centre africain d’études supérieures en gestion (CESAG), Dakar (Sénégal), 06 au 09 décembre 2021)</w:t>
+      </w:r>
+    </w:p>
+    <w:p>
+      <w:pPr>
+        <w:suppressAutoHyphens/>
+        <w:spacing w:line="240" w:lineRule="auto"/>
+        <w:ind w:right="146" w:firstLine="0"/>
+        <w:rPr>
+          <w:b/>
+          <w:color w:val="000000"/>
+          <w:spacing w:val="-1"/>
+          <w:sz w:val="26"/>
+          <w:szCs w:val="26"/>
+          <w:u w:val="single"/>
+        </w:rPr>
+      </w:pPr>
+    </w:p>
+    <w:p>
+      <w:pPr>
+        <w:spacing w:line="240" w:lineRule="auto"/>
+        <w:ind w:firstLine="0"/>
+        <w:jc w:val="left"/>
+        <w:rPr>
+          <w:iCs/>
+          <w:sz w:val="26"/>
+          <w:szCs w:val="26"/>
+        </w:rPr>
+      </w:pPr>
+      <w:r>
+        <w:rPr>
+          <w:sz w:val="26"/>
+        </w:rPr>
+        <w:t>Auteur : AZANDJEME Colette Sylvie</w:t>
+      </w:r>
+    </w:p>
+    <w:p>
+      <w:pPr>
+        <w:spacing w:line="240" w:lineRule="auto"/>
+        <w:ind w:firstLine="0"/>
+        <w:jc w:val="left"/>
+        <w:rPr>
+          <w:iCs/>
+          <w:sz w:val="26"/>
+          <w:szCs w:val="26"/>
+        </w:rPr>
+      </w:pPr>
+      <w:r>
+        <w:rPr>
+          <w:sz w:val="26"/>
+        </w:rPr>
+        <w:t>Titre de la communication : Etat nutritionnel des gestantes et pronostic néonatal au Centre National Hospitalier Et Universitaire Hubert Koutoukou Maga</w:t>
+      </w:r>
+    </w:p>
+    <w:p>
+      <w:pPr>
+        <w:spacing w:line="240" w:lineRule="auto"/>
+        <w:ind w:firstLine="0"/>
+        <w:jc w:val="left"/>
+        <w:rPr>
+          <w:b/>
+          <w:bCs/>
+          <w:i/>
+          <w:iCs/>
+          <w:sz w:val="26"/>
+          <w:szCs w:val="26"/>
+        </w:rPr>
+      </w:pPr>
+      <w:r>
+        <w:rPr>
+          <w:i/>
+          <w:sz w:val="26"/>
+        </w:rPr>
+        <w:t>In : 5ème édition des Journées Scientifiques du CAMES (Centre africain d’études supérieures en gestion (CESAG), Dakar (Sénégal), 06 au 09 décembre 2021)</w:t>
+      </w:r>
+    </w:p>
+    <w:p>
+      <w:pPr>
+        <w:suppressAutoHyphens/>
+        <w:spacing w:line="240" w:lineRule="auto"/>
+        <w:ind w:right="146" w:firstLine="0"/>
+        <w:rPr>
+          <w:b/>
+          <w:color w:val="000000"/>
+          <w:spacing w:val="-1"/>
+          <w:sz w:val="26"/>
+          <w:szCs w:val="26"/>
+          <w:u w:val="single"/>
+        </w:rPr>
+      </w:pPr>
+    </w:p>
+    <w:p>
+      <w:pPr>
+        <w:tabs>
+          <w:tab w:val="left" w:pos="2082"/>
+        </w:tabs>
+        <w:spacing w:line="240" w:lineRule="auto"/>
+        <w:ind w:firstLine="0"/>
+        <w:jc w:val="left"/>
+        <w:rPr>
+          <w:iCs/>
+          <w:sz w:val="26"/>
+          <w:szCs w:val="26"/>
+        </w:rPr>
+      </w:pPr>
+      <w:r>
+        <w:rPr>
+          <w:sz w:val="26"/>
+        </w:rPr>
+        <w:t>Année : 2024</w:t>
+      </w:r>
+    </w:p>
+    <w:p>
+      <w:pPr>
+        <w:spacing w:line="240" w:lineRule="auto"/>
+        <w:ind w:firstLine="0"/>
+        <w:jc w:val="left"/>
+        <w:rPr>
+          <w:iCs/>
+          <w:sz w:val="26"/>
+          <w:szCs w:val="26"/>
+        </w:rPr>
+      </w:pPr>
+      <w:r>
+        <w:rPr>
+          <w:sz w:val="26"/>
+        </w:rPr>
+        <w:t>Auteur : AZANDJEME Colette Sylvie</w:t>
+      </w:r>
+    </w:p>
+    <w:p>
+      <w:pPr>
+        <w:spacing w:line="240" w:lineRule="auto"/>
+        <w:ind w:firstLine="0"/>
+        <w:jc w:val="left"/>
+        <w:rPr>
+          <w:iCs/>
+          <w:sz w:val="26"/>
+          <w:szCs w:val="26"/>
+        </w:rPr>
+      </w:pPr>
+      <w:r>
+        <w:rPr>
+          <w:sz w:val="26"/>
+        </w:rPr>
+        <w:t>Titre de la communication : Prise en charge nutritionnelle de l’obésité</w:t>
+      </w:r>
+    </w:p>
+    <w:p>
+      <w:pPr>
+        <w:spacing w:line="240" w:lineRule="auto"/>
+        <w:ind w:firstLine="0"/>
+        <w:jc w:val="left"/>
+        <w:rPr>
+          <w:b/>
+          <w:bCs/>
+          <w:i/>
+          <w:iCs/>
+          <w:sz w:val="26"/>
+          <w:szCs w:val="26"/>
+        </w:rPr>
+      </w:pPr>
+      <w:r>
+        <w:rPr>
+          <w:i/>
+          <w:sz w:val="26"/>
+        </w:rPr>
+        <w:t>In : 4e Congrès international de la Société Béninoise de Cardiologie &amp; 3e Congrès international de l’Association des Sociétés de Cardiologie de l’Afrique de l’Ouest et du Centre (Palais des Congrès de Cotonou, Bénin, 05 au 07 décembre 2024)</w:t>
+      </w:r>
+    </w:p>
+    <w:p>
+      <w:pPr>
+        <w:suppressAutoHyphens/>
+        <w:spacing w:line="240" w:lineRule="auto"/>
+        <w:ind w:right="146" w:firstLine="0"/>
+        <w:rPr>
+          <w:b/>
+          <w:color w:val="000000"/>
+          <w:spacing w:val="-1"/>
+          <w:sz w:val="26"/>
+          <w:szCs w:val="26"/>
+          <w:u w:val="single"/>
+        </w:rPr>
+      </w:pPr>
+    </w:p>
+    <w:p>
+      <w:pPr>
+        <w:tabs>
+          <w:tab w:val="left" w:pos="2082"/>
+        </w:tabs>
+        <w:spacing w:line="240" w:lineRule="auto"/>
+        <w:ind w:firstLine="0"/>
+        <w:jc w:val="left"/>
+        <w:rPr>
+          <w:iCs/>
+          <w:sz w:val="26"/>
+          <w:szCs w:val="26"/>
+        </w:rPr>
+      </w:pPr>
+      <w:r>
+        <w:rPr>
+          <w:sz w:val="26"/>
+        </w:rPr>
+        <w:t>Année : 2025</w:t>
+      </w:r>
+    </w:p>
+    <w:p>
+      <w:pPr>
+        <w:spacing w:line="240" w:lineRule="auto"/>
+        <w:ind w:firstLine="0"/>
+        <w:jc w:val="left"/>
+        <w:rPr>
+          <w:iCs/>
+          <w:sz w:val="26"/>
+          <w:szCs w:val="26"/>
+        </w:rPr>
+      </w:pPr>
+      <w:r>
+        <w:rPr>
+          <w:sz w:val="26"/>
+        </w:rPr>
+        <w:t>Auteur : AZANDJEME Colette Sylvie</w:t>
+      </w:r>
+    </w:p>
+    <w:p>
+      <w:pPr>
+        <w:spacing w:line="240" w:lineRule="auto"/>
+        <w:ind w:firstLine="0"/>
+        <w:jc w:val="left"/>
+        <w:rPr>
+          <w:iCs/>
+          <w:sz w:val="26"/>
+          <w:szCs w:val="26"/>
+        </w:rPr>
+      </w:pPr>
+      <w:r>
+        <w:rPr>
+          <w:sz w:val="26"/>
+        </w:rPr>
+        <w:t>Titre de la communication : Lien et causalité entre l’exposition aux pesticides et le risque de développement du diabète</w:t>
+      </w:r>
+    </w:p>
+    <w:p>
+      <w:pPr>
+        <w:spacing w:line="240" w:lineRule="auto"/>
+        <w:ind w:firstLine="0"/>
+        <w:jc w:val="left"/>
+        <w:rPr>
+          <w:b/>
+          <w:bCs/>
+          <w:i/>
+          <w:iCs/>
+          <w:sz w:val="26"/>
+          <w:szCs w:val="26"/>
+        </w:rPr>
+      </w:pPr>
+      <w:r>
+        <w:rPr>
+          <w:i/>
+          <w:sz w:val="26"/>
+        </w:rPr>
+        <w:t>In : Atelier sous-régional des programmes Terres nourricières et Promotion de l’agriculture familiale en Afrique de l’Ouest (Pafao), organisé par le CFSI et l’Oadel (Lomé, Togo, 04 au 06 novembre 2025)</w:t>
+      </w:r>
+    </w:p>
+    <w:p>
+      <w:pPr>
+        <w:suppressAutoHyphens/>
+        <w:spacing w:line="240" w:lineRule="auto"/>
+        <w:ind w:right="146" w:firstLine="0"/>
+        <w:rPr>
+          <w:b/>
+          <w:color w:val="000000"/>
+          <w:spacing w:val="-1"/>
+          <w:sz w:val="26"/>
+          <w:szCs w:val="26"/>
+          <w:u w:val="single"/>
+        </w:rPr>
+      </w:pPr>
+    </w:p>
+    <w:p>
+      <w:pPr>
+        <w:spacing w:line="240" w:lineRule="auto"/>
+        <w:ind w:firstLine="0"/>
+        <w:jc w:val="left"/>
+        <w:rPr>
+          <w:iCs/>
+          <w:sz w:val="26"/>
+          <w:szCs w:val="26"/>
+        </w:rPr>
+      </w:pPr>
+      <w:r>
+        <w:rPr>
+          <w:sz w:val="26"/>
+        </w:rPr>
+        <w:t>Auteur : AZANDJEME Colette Sylvie</w:t>
+      </w:r>
+    </w:p>
+    <w:p>
+      <w:pPr>
+        <w:spacing w:line="240" w:lineRule="auto"/>
+        <w:ind w:firstLine="0"/>
+        <w:jc w:val="left"/>
+        <w:rPr>
+          <w:iCs/>
+          <w:sz w:val="26"/>
+          <w:szCs w:val="26"/>
+        </w:rPr>
+      </w:pPr>
+      <w:r>
+        <w:rPr>
+          <w:sz w:val="26"/>
+        </w:rPr>
+        <w:t>Titre de la communication : Double/triple fardeau de la malnutrition en Afrique de l’Ouest</w:t>
+      </w:r>
+    </w:p>
+    <w:p>
+      <w:pPr>
+        <w:spacing w:line="240" w:lineRule="auto"/>
+        <w:ind w:firstLine="0"/>
+        <w:jc w:val="left"/>
+        <w:rPr>
+          <w:b/>
+          <w:bCs/>
+          <w:i/>
+          <w:iCs/>
+          <w:sz w:val="26"/>
+          <w:szCs w:val="26"/>
+        </w:rPr>
+      </w:pPr>
+      <w:r>
+        <w:rPr>
+          <w:i/>
+          <w:sz w:val="26"/>
+        </w:rPr>
+        <w:t>In : Atelier sous-régional des programmes Terres nourricières et Promotion de l’agriculture familiale en Afrique de l’Ouest (Pafao), organisé par le CFSI et l’Oadel (Lomé, Togo, 04 au 06 novembre 2025)</w:t>
+      </w:r>
+    </w:p>
+    <w:p>
+      <w:pPr>
+        <w:suppressAutoHyphens/>
+        <w:spacing w:line="240" w:lineRule="auto"/>
+        <w:ind w:right="146" w:firstLine="0"/>
+        <w:rPr>
+          <w:b/>
+          <w:color w:val="000000"/>
+          <w:spacing w:val="-1"/>
+          <w:sz w:val="26"/>
+          <w:szCs w:val="26"/>
+          <w:u w:val="single"/>
+        </w:rPr>
+      </w:pPr>
+    </w:p>
+    <w:p>
+      <w:pPr>
+        <w:spacing w:line="240" w:lineRule="auto"/>
+        <w:ind w:firstLine="0"/>
+        <w:jc w:val="left"/>
+        <w:rPr>
+          <w:iCs/>
+          <w:sz w:val="26"/>
+          <w:szCs w:val="26"/>
+        </w:rPr>
+      </w:pPr>
+      <w:r>
+        <w:rPr>
+          <w:sz w:val="26"/>
+        </w:rPr>
+        <w:t>Auteur : AZANDJEME Colette Sylvie</w:t>
+      </w:r>
+    </w:p>
+    <w:p>
+      <w:pPr>
+        <w:spacing w:line="240" w:lineRule="auto"/>
+        <w:ind w:firstLine="0"/>
+        <w:jc w:val="left"/>
+        <w:rPr>
+          <w:iCs/>
+          <w:sz w:val="26"/>
+          <w:szCs w:val="26"/>
+        </w:rPr>
+      </w:pPr>
+      <w:r>
+        <w:rPr>
+          <w:sz w:val="26"/>
+        </w:rPr>
+        <w:t>Titre de la communication : Environnements alimentaires au Sénégal et au Bénin</w:t>
+      </w:r>
+    </w:p>
+    <w:p>
+      <w:pPr>
+        <w:spacing w:line="240" w:lineRule="auto"/>
+        <w:ind w:firstLine="0"/>
+        <w:jc w:val="left"/>
+        <w:rPr>
+          <w:b/>
+          <w:bCs/>
+          <w:i/>
+          <w:iCs/>
+          <w:sz w:val="26"/>
+          <w:szCs w:val="26"/>
+        </w:rPr>
+      </w:pPr>
+      <w:r>
+        <w:rPr>
+          <w:i/>
+          <w:sz w:val="26"/>
+        </w:rPr>
+        <w:t>In : Atelier sous-régional des programmes Terres nourricières et Promotion de l’agriculture familiale en Afrique de l’Ouest (Pafao), organisé par le CFSI et l’Oadel (Lomé, Togo, 04 au 06 novembre 2025)</w:t>
+      </w:r>
+    </w:p>
+    <w:p>
+      <w:pPr>
+        <w:suppressAutoHyphens/>
+        <w:spacing w:line="240" w:lineRule="auto"/>
+        <w:ind w:right="146" w:firstLine="0"/>
+        <w:rPr>
+          <w:b/>
+          <w:color w:val="000000"/>
+          <w:spacing w:val="-1"/>
+          <w:sz w:val="26"/>
+          <w:szCs w:val="26"/>
+          <w:u w:val="single"/>
+        </w:rPr>
+      </w:pPr>
+    </w:p>
+    <w:p>
+      <w:pPr>
+        <w:suppressAutoHyphens/>
+        <w:spacing w:line="240" w:lineRule="auto"/>
+        <w:ind w:right="146" w:firstLine="0"/>
+        <w:rPr>
+          <w:b/>
+          <w:color w:val="000000"/>
+          <w:spacing w:val="-1"/>
+          <w:sz w:val="26"/>
+          <w:szCs w:val="26"/>
+          <w:u w:val="single"/>
+        </w:rPr>
+      </w:pPr>
+      <w:r>
+        <w:rPr>
+          <w:b/>
+          <w:sz w:val="26"/>
+        </w:rPr>
+        <w:t xml:space="preserve">Communication dans des congrès nationaux avec actes </w:t>
+      </w:r>
+    </w:p>
+    <w:p>
+      <w:pPr>
+        <w:tabs>
+          <w:tab w:val="left" w:pos="2082"/>
+        </w:tabs>
+        <w:spacing w:line="240" w:lineRule="auto"/>
+        <w:ind w:firstLine="0"/>
+        <w:jc w:val="left"/>
+        <w:rPr>
+          <w:iCs/>
+          <w:sz w:val="26"/>
+          <w:szCs w:val="26"/>
+        </w:rPr>
+      </w:pPr>
+      <w:r>
+        <w:rPr>
+          <w:sz w:val="26"/>
+        </w:rPr>
+        <w:t>Année : 2022</w:t>
+      </w:r>
+    </w:p>
+    <w:p>
+      <w:pPr>
+        <w:spacing w:line="240" w:lineRule="auto"/>
+        <w:ind w:firstLine="0"/>
+        <w:jc w:val="left"/>
+        <w:rPr>
+          <w:iCs/>
+          <w:sz w:val="26"/>
+          <w:szCs w:val="26"/>
+        </w:rPr>
+      </w:pPr>
+      <w:r>
+        <w:rPr>
+          <w:sz w:val="26"/>
+        </w:rPr>
+        <w:t>Auteur : AZANDJEME Colette Sylvie</w:t>
+      </w:r>
+    </w:p>
+    <w:p>
+      <w:pPr>
+        <w:spacing w:line="240" w:lineRule="auto"/>
+        <w:ind w:firstLine="0"/>
+        <w:jc w:val="left"/>
+        <w:rPr>
+          <w:iCs/>
+          <w:sz w:val="26"/>
+          <w:szCs w:val="26"/>
+        </w:rPr>
+      </w:pPr>
+      <w:r>
+        <w:rPr>
+          <w:sz w:val="26"/>
+        </w:rPr>
+        <w:t>Titre de la communication : Dénutrition chez les patients en postopératoire de chirurgie digestive au CNHU-HKM et au CHUD-OP en 2022</w:t>
+      </w:r>
+    </w:p>
+    <w:p>
+      <w:pPr>
+        <w:spacing w:line="240" w:lineRule="auto"/>
+        <w:ind w:firstLine="0"/>
+        <w:jc w:val="left"/>
+        <w:rPr>
+          <w:b/>
+          <w:bCs/>
+          <w:i/>
+          <w:iCs/>
+          <w:sz w:val="26"/>
+          <w:szCs w:val="26"/>
+        </w:rPr>
+      </w:pPr>
+      <w:r>
+        <w:rPr>
+          <w:i/>
+          <w:sz w:val="26"/>
+        </w:rPr>
+        <w:t>In : 5èmes Journées Scientifiques de l’Institut Régional de Santé Publique Comlan Alfred QUENUM (Ouidah (Bénin), 1er et 2 décembre 2022)</w:t>
+      </w:r>
+    </w:p>
+    <w:p>
+      <w:pPr>
+        <w:suppressAutoHyphens/>
+        <w:spacing w:line="240" w:lineRule="auto"/>
+        <w:ind w:right="146" w:firstLine="0"/>
+        <w:rPr>
+          <w:b/>
+          <w:color w:val="000000"/>
+          <w:spacing w:val="-1"/>
+          <w:sz w:val="26"/>
+          <w:szCs w:val="26"/>
+          <w:u w:val="single"/>
+        </w:rPr>
+      </w:pPr>
+    </w:p>
+    <w:p>
+      <w:pPr>
+        <w:spacing w:line="240" w:lineRule="auto"/>
+        <w:ind w:firstLine="0"/>
+        <w:jc w:val="left"/>
+        <w:rPr>
+          <w:iCs/>
+          <w:sz w:val="26"/>
+          <w:szCs w:val="26"/>
+        </w:rPr>
+      </w:pPr>
+      <w:r>
+        <w:rPr>
+          <w:sz w:val="26"/>
+        </w:rPr>
+        <w:t>Auteur : AZANDJEME Colette Sylvie</w:t>
+      </w:r>
+    </w:p>
+    <w:p>
+      <w:pPr>
+        <w:spacing w:line="240" w:lineRule="auto"/>
+        <w:ind w:firstLine="0"/>
+        <w:jc w:val="left"/>
+        <w:rPr>
+          <w:iCs/>
+          <w:sz w:val="26"/>
+          <w:szCs w:val="26"/>
+        </w:rPr>
+      </w:pPr>
+      <w:r>
+        <w:rPr>
+          <w:sz w:val="26"/>
+        </w:rPr>
+        <w:t>Titre de la communication : Profil nutritionnel des patients atteints d’hépatopathie chronique au CNHU-HKM de Cotonou</w:t>
+      </w:r>
+    </w:p>
+    <w:p>
+      <w:pPr>
+        <w:spacing w:line="240" w:lineRule="auto"/>
+        <w:ind w:firstLine="0"/>
+        <w:jc w:val="left"/>
+        <w:rPr>
+          <w:b/>
+          <w:bCs/>
+          <w:i/>
+          <w:iCs/>
+          <w:sz w:val="26"/>
+          <w:szCs w:val="26"/>
+        </w:rPr>
+      </w:pPr>
+      <w:r>
+        <w:rPr>
+          <w:i/>
+          <w:sz w:val="26"/>
+        </w:rPr>
+        <w:t>In : 5èmes Journées Scientifiques de l’Institut Régional de Santé Publique Comlan Alfred QUENUM (Ouidah (Bénin), 1er et 2 décembre 2022)</w:t>
+      </w:r>
+    </w:p>
+    <w:p>
+      <w:pPr>
+        <w:suppressAutoHyphens/>
+        <w:spacing w:line="240" w:lineRule="auto"/>
+        <w:ind w:right="146" w:firstLine="0"/>
+        <w:rPr>
+          <w:b/>
+          <w:color w:val="000000"/>
+          <w:spacing w:val="-1"/>
+          <w:sz w:val="26"/>
+          <w:szCs w:val="26"/>
+          <w:u w:val="single"/>
+        </w:rPr>
+      </w:pPr>
+    </w:p>
+    <w:p>
+      <w:pPr>
+        <w:spacing w:line="240" w:lineRule="auto"/>
+        <w:ind w:firstLine="0"/>
+        <w:jc w:val="left"/>
+        <w:rPr>
+          <w:iCs/>
+          <w:sz w:val="26"/>
+          <w:szCs w:val="26"/>
+        </w:rPr>
+      </w:pPr>
+      <w:r>
+        <w:rPr>
+          <w:sz w:val="26"/>
+        </w:rPr>
+        <w:t>Auteur : AZANDJEME Colette Sylvie</w:t>
+      </w:r>
+    </w:p>
+    <w:p>
+      <w:pPr>
+        <w:spacing w:line="240" w:lineRule="auto"/>
+        <w:ind w:firstLine="0"/>
+        <w:jc w:val="left"/>
+        <w:rPr>
+          <w:iCs/>
+          <w:sz w:val="26"/>
+          <w:szCs w:val="26"/>
+        </w:rPr>
+      </w:pPr>
+      <w:r>
+        <w:rPr>
+          <w:sz w:val="26"/>
+        </w:rPr>
+        <w:t>Titre de la communication : Habitudes de consommation des alicaments et facteurs associés dans la ville de Cotonou au Bénin</w:t>
+      </w:r>
+    </w:p>
+    <w:p>
+      <w:pPr>
+        <w:spacing w:line="240" w:lineRule="auto"/>
+        <w:ind w:firstLine="0"/>
+        <w:jc w:val="left"/>
+        <w:rPr>
+          <w:b/>
+          <w:bCs/>
+          <w:i/>
+          <w:iCs/>
+          <w:sz w:val="26"/>
+          <w:szCs w:val="26"/>
+        </w:rPr>
+      </w:pPr>
+      <w:r>
+        <w:rPr>
+          <w:i/>
+          <w:sz w:val="26"/>
+        </w:rPr>
+        <w:t>In : 5èmes Journées Scientifiques de l’Institut Régional de Santé Publique Comlan Alfred QUENUM (Ouidah (Bénin), 1er et 2 décembre 2022)</w:t>
+      </w:r>
+    </w:p>
+    <w:p>
+      <w:pPr>
+        <w:suppressAutoHyphens/>
+        <w:spacing w:line="240" w:lineRule="auto"/>
+        <w:ind w:right="146" w:firstLine="0"/>
+        <w:rPr>
+          <w:b/>
+          <w:color w:val="000000"/>
+          <w:spacing w:val="-1"/>
+          <w:sz w:val="26"/>
+          <w:szCs w:val="26"/>
+          <w:u w:val="single"/>
+        </w:rPr>
+      </w:pPr>
+    </w:p>
+    <w:p>
+      <w:pPr>
+        <w:spacing w:line="240" w:lineRule="auto"/>
+        <w:ind w:firstLine="0"/>
+        <w:jc w:val="left"/>
+        <w:rPr>
+          <w:iCs/>
+          <w:sz w:val="26"/>
+          <w:szCs w:val="26"/>
+        </w:rPr>
+      </w:pPr>
+      <w:r>
+        <w:rPr>
+          <w:sz w:val="26"/>
+        </w:rPr>
+        <w:t>Auteur : AZANDJEME Colette Sylvie</w:t>
+      </w:r>
+    </w:p>
+    <w:p>
+      <w:pPr>
+        <w:spacing w:line="240" w:lineRule="auto"/>
+        <w:ind w:firstLine="0"/>
+        <w:jc w:val="left"/>
+        <w:rPr>
+          <w:iCs/>
+          <w:sz w:val="26"/>
+          <w:szCs w:val="26"/>
+        </w:rPr>
+      </w:pPr>
+      <w:r>
+        <w:rPr>
+          <w:sz w:val="26"/>
+        </w:rPr>
+        <w:t>Titre de la communication : Évaluation de la qualité des soins nutritionnels chez l’enfant hospitalisé au CHU-MEL en 2022</w:t>
+      </w:r>
+    </w:p>
+    <w:p>
+      <w:pPr>
+        <w:spacing w:line="240" w:lineRule="auto"/>
+        <w:ind w:firstLine="0"/>
+        <w:jc w:val="left"/>
+        <w:rPr>
+          <w:b/>
+          <w:bCs/>
+          <w:i/>
+          <w:iCs/>
+          <w:sz w:val="26"/>
+          <w:szCs w:val="26"/>
+        </w:rPr>
+      </w:pPr>
+      <w:r>
+        <w:rPr>
+          <w:i/>
+          <w:sz w:val="26"/>
+        </w:rPr>
+        <w:t>In : 5èmes Journées Scientifiques de l’Institut Régional de Santé Publique Comlan Alfred QUENUM (Ouidah (Bénin), 1er et 2 décembre 2022)</w:t>
+      </w:r>
+    </w:p>
+    <w:p>
+      <w:pPr>
+        <w:suppressAutoHyphens/>
+        <w:spacing w:line="240" w:lineRule="auto"/>
+        <w:ind w:right="146" w:firstLine="0"/>
+        <w:rPr>
+          <w:b/>
+          <w:color w:val="000000"/>
+          <w:spacing w:val="-1"/>
+          <w:sz w:val="26"/>
+          <w:szCs w:val="26"/>
+          <w:u w:val="single"/>
+        </w:rPr>
+      </w:pPr>
+    </w:p>
+    <w:p>
+      <w:pPr>
+        <w:tabs>
+          <w:tab w:val="left" w:pos="2082"/>
+        </w:tabs>
+        <w:spacing w:line="240" w:lineRule="auto"/>
+        <w:ind w:firstLine="0"/>
+        <w:jc w:val="left"/>
+        <w:rPr>
+          <w:iCs/>
+          <w:sz w:val="26"/>
+          <w:szCs w:val="26"/>
+        </w:rPr>
+      </w:pPr>
+      <w:r>
+        <w:rPr>
+          <w:sz w:val="26"/>
+        </w:rPr>
+        <w:t>Année : 2024</w:t>
+      </w:r>
+    </w:p>
+    <w:p>
+      <w:pPr>
+        <w:spacing w:line="240" w:lineRule="auto"/>
+        <w:ind w:firstLine="0"/>
+        <w:jc w:val="left"/>
+        <w:rPr>
+          <w:iCs/>
+          <w:sz w:val="26"/>
+          <w:szCs w:val="26"/>
+        </w:rPr>
+      </w:pPr>
+      <w:r>
+        <w:rPr>
+          <w:sz w:val="26"/>
+        </w:rPr>
+        <w:t>Auteurs : AZANDJEME Colette Sylvie, Aïssi Flaubert Vidjinnagni, Houssou Gbèmahon, Sossou Ericie, Sosssa Charles</w:t>
+      </w:r>
+    </w:p>
+    <w:p>
+      <w:pPr>
+        <w:spacing w:line="240" w:lineRule="auto"/>
+        <w:ind w:firstLine="0"/>
+        <w:jc w:val="left"/>
+        <w:rPr>
+          <w:iCs/>
+          <w:sz w:val="26"/>
+          <w:szCs w:val="26"/>
+        </w:rPr>
+      </w:pPr>
+      <w:r>
+        <w:rPr>
+          <w:sz w:val="26"/>
+        </w:rPr>
+        <w:t>Titre de la communication : QUALITÉ DE VIE DES ADOLESCENTES ENCEINTES DANS LA ZONE SANITAIRE APLAHOUÉ-DJAKOTOMEY-DOGBO (ADD) AU BÉNIN</w:t>
+      </w:r>
+    </w:p>
+    <w:p>
+      <w:pPr>
+        <w:spacing w:line="240" w:lineRule="auto"/>
+        <w:ind w:firstLine="0"/>
+        <w:jc w:val="left"/>
+        <w:rPr>
+          <w:b/>
+          <w:bCs/>
+          <w:i/>
+          <w:iCs/>
+          <w:sz w:val="26"/>
+          <w:szCs w:val="26"/>
+        </w:rPr>
+      </w:pPr>
+      <w:r>
+        <w:rPr>
+          <w:i/>
+          <w:sz w:val="26"/>
+        </w:rPr>
+        <w:t>In : 3èmes Journées Scientifiques des Sciences de la Santé (CO51, Faculté des Sciences de la Santé, Cotonou (Bénin), 1er au 5 octobre 2024)</w:t>
+      </w:r>
+    </w:p>
+    <w:p>
+      <w:pPr>
+        <w:suppressAutoHyphens/>
+        <w:spacing w:line="240" w:lineRule="auto"/>
+        <w:ind w:right="146" w:firstLine="0"/>
+        <w:rPr>
+          <w:b/>
+          <w:color w:val="000000"/>
+          <w:spacing w:val="-1"/>
+          <w:sz w:val="26"/>
+          <w:szCs w:val="26"/>
+          <w:u w:val="single"/>
+        </w:rPr>
+      </w:pPr>
+    </w:p>
+    <w:p>
+      <w:pPr>
+        <w:spacing w:line="240" w:lineRule="auto"/>
+        <w:ind w:firstLine="0"/>
+        <w:jc w:val="left"/>
+        <w:rPr>
+          <w:iCs/>
+          <w:sz w:val="26"/>
+          <w:szCs w:val="26"/>
+        </w:rPr>
+      </w:pPr>
+      <w:r>
+        <w:rPr>
+          <w:sz w:val="26"/>
+        </w:rPr>
+        <w:t>Auteurs : AZANDJEME Colette Sylvie, Aïssi Flaubert Vidjinnagni, Houssou Gbèmahon, Sossou Ericie, Sosssa Charles</w:t>
+      </w:r>
+    </w:p>
+    <w:p>
+      <w:pPr>
+        <w:spacing w:line="240" w:lineRule="auto"/>
+        <w:ind w:firstLine="0"/>
+        <w:jc w:val="left"/>
+        <w:rPr>
+          <w:iCs/>
+          <w:sz w:val="26"/>
+          <w:szCs w:val="26"/>
+        </w:rPr>
+      </w:pPr>
+      <w:r>
+        <w:rPr>
+          <w:sz w:val="26"/>
+        </w:rPr>
+        <w:t>Titre de la communication : AMPLEUR ET DÉTERMINANTS DU DIABÈTE CHEZ LES ADULTES EN MILIEU RURAL : CAS DE LA COMMUNE DE KPOMASE AU SUD DU BÉNIN</w:t>
+      </w:r>
+    </w:p>
+    <w:p>
+      <w:pPr>
+        <w:spacing w:line="240" w:lineRule="auto"/>
+        <w:ind w:firstLine="0"/>
+        <w:jc w:val="left"/>
+        <w:rPr>
+          <w:b/>
+          <w:bCs/>
+          <w:i/>
+          <w:iCs/>
+          <w:sz w:val="26"/>
+          <w:szCs w:val="26"/>
+        </w:rPr>
+      </w:pPr>
+      <w:r>
+        <w:rPr>
+          <w:i/>
+          <w:sz w:val="26"/>
+        </w:rPr>
+        <w:t>In : 3èmes Journées Scientifiques des Sciences de la Santé (CO52, Faculté des Sciences de la Santé, Cotonou (Bénin), 1er au 5 octobre 2024)</w:t>
+      </w:r>
+    </w:p>
+    <w:p>
+      <w:pPr>
+        <w:suppressAutoHyphens/>
+        <w:spacing w:line="240" w:lineRule="auto"/>
+        <w:ind w:right="146" w:firstLine="0"/>
+        <w:rPr>
+          <w:b/>
+          <w:color w:val="000000"/>
+          <w:spacing w:val="-1"/>
+          <w:sz w:val="26"/>
+          <w:szCs w:val="26"/>
+          <w:u w:val="single"/>
+        </w:rPr>
+      </w:pPr>
+    </w:p>
+    <w:p>
+      <w:pPr>
+        <w:tabs>
+          <w:tab w:val="left" w:pos="2082"/>
+        </w:tabs>
+        <w:spacing w:line="240" w:lineRule="auto"/>
+        <w:ind w:firstLine="0"/>
+        <w:jc w:val="left"/>
+        <w:rPr>
+          <w:iCs/>
+          <w:sz w:val="26"/>
+          <w:szCs w:val="26"/>
+        </w:rPr>
+      </w:pPr>
+      <w:r>
+        <w:rPr>
+          <w:sz w:val="26"/>
+        </w:rPr>
+        <w:t>Année : 2025</w:t>
+      </w:r>
+    </w:p>
+    <w:p>
+      <w:pPr>
+        <w:spacing w:line="240" w:lineRule="auto"/>
+        <w:ind w:firstLine="0"/>
+        <w:jc w:val="left"/>
+        <w:rPr>
+          <w:iCs/>
+          <w:sz w:val="26"/>
+          <w:szCs w:val="26"/>
+        </w:rPr>
+      </w:pPr>
+      <w:r>
+        <w:rPr>
+          <w:sz w:val="26"/>
+        </w:rPr>
+        <w:t>Auteur : AZANDJEME Colette Sylvie</w:t>
+      </w:r>
+    </w:p>
+    <w:p>
+      <w:pPr>
+        <w:spacing w:line="240" w:lineRule="auto"/>
+        <w:ind w:firstLine="0"/>
+        <w:jc w:val="left"/>
+        <w:rPr>
+          <w:iCs/>
+          <w:sz w:val="26"/>
+          <w:szCs w:val="26"/>
+        </w:rPr>
+      </w:pPr>
+      <w:r>
+        <w:rPr>
+          <w:sz w:val="26"/>
+        </w:rPr>
+        <w:t>Titre de la communication : Les compléments alimentaires dans la prise en charge des maladies non transmissibles</w:t>
+      </w:r>
+    </w:p>
+    <w:p>
+      <w:pPr>
+        <w:spacing w:line="240" w:lineRule="auto"/>
+        <w:ind w:firstLine="0"/>
+        <w:jc w:val="left"/>
+        <w:rPr>
+          <w:b/>
+          <w:bCs/>
+          <w:i/>
+          <w:iCs/>
+          <w:sz w:val="26"/>
+          <w:szCs w:val="26"/>
+        </w:rPr>
+      </w:pPr>
+      <w:r>
+        <w:rPr>
+          <w:i/>
+          <w:sz w:val="26"/>
+        </w:rPr>
+        <w:t>In : 4èmes Journées Scientifiques des Sciences de la Santé (Cotonou (Bénin), 23 au 27 septembre 2025)</w:t>
+      </w:r>
+    </w:p>
+    <w:p>
+      <w:pPr>
+        <w:suppressAutoHyphens/>
+        <w:spacing w:line="240" w:lineRule="auto"/>
+        <w:ind w:right="146" w:firstLine="0"/>
+        <w:rPr>
+          <w:b/>
+          <w:color w:val="000000"/>
+          <w:spacing w:val="-1"/>
+          <w:sz w:val="26"/>
+          <w:szCs w:val="26"/>
+          <w:u w:val="single"/>
+        </w:rPr>
+      </w:pPr>
+    </w:p>
+    <w:p>
+      <w:pPr>
+        <w:suppressAutoHyphens/>
+        <w:spacing w:line="240" w:lineRule="auto"/>
+        <w:ind w:right="146" w:firstLine="0"/>
+        <w:rPr>
+          <w:b/>
+          <w:color w:val="000000"/>
+          <w:spacing w:val="-1"/>
+          <w:sz w:val="26"/>
+          <w:szCs w:val="26"/>
+          <w:u w:val="single"/>
+        </w:rPr>
+      </w:pPr>
     </w:p>
     <w:sdt>
       <w:sdtPr>
@@ -1805,22 +3271,6 @@
         </w:p>
       </w:sdtContent>
     </w:sdt>
-    <w:p>
-      <w:pPr>
-        <w:suppressAutoHyphens/>
-        <w:spacing w:line="240" w:lineRule="auto"/>
-        <w:ind w:right="146" w:firstLine="0"/>
-        <w:rPr>
-          <w:b/>
-          <w:color w:val="000000"/>
-          <w:spacing w:val="-1"/>
-          <w:sz w:val="26"/>
-          <w:szCs w:val="26"/>
-          <w:u w:val="single"/>
-        </w:rPr>
-      </w:pPr>
-    </w:p>
-    <w:p/>
     <w:sectPr>
       <w:pgSz w:w="11906" w:h="16838"/>
       <w:pgMar w:top="1440" w:right="1440" w:bottom="1440" w:left="1440" w:header="708" w:footer="708" w:gutter="0"/>

</xml_diff>

<commit_message>
Reconcile communication lists and flag missing references
Co-authored-by: arena-agent <297053741+arena-agent@users.noreply.github.com>
</commit_message>
<xml_diff>
--- a/Liste communications .docx
+++ b/Liste communications .docx
@@ -265,6 +265,13 @@
           </w:r>
         </w:sdtContent>
       </w:sdt>
+      <w:r>
+        <w:rPr>
+          <w:i/>
+          <w:highlight w:val="yellow"/>
+        </w:rPr>
+        <w:t xml:space="preserve"> [À COMPLÉTER : livret source, note/code et pagination à rechercher.]</w:t>
+      </w:r>
     </w:p>
     <w:sdt>
       <w:sdtPr>
@@ -706,6 +713,13 @@
           </w:r>
         </w:sdtContent>
       </w:sdt>
+      <w:r>
+        <w:rPr>
+          <w:i/>
+          <w:highlight w:val="yellow"/>
+        </w:rPr>
+        <w:t xml:space="preserve"> [À COMPLÉTER : livret source, note/code et pagination à rechercher.]</w:t>
+      </w:r>
     </w:p>
     <w:sdt>
       <w:sdtPr>
@@ -1118,6 +1132,13 @@
           </w:r>
         </w:sdtContent>
       </w:sdt>
+      <w:r>
+        <w:rPr>
+          <w:i/>
+          <w:highlight w:val="yellow"/>
+        </w:rPr>
+        <w:t xml:space="preserve"> [À COMPLÉTER : livret source, note/code et pagination à rechercher.]</w:t>
+      </w:r>
     </w:p>
     <w:p>
       <w:pPr>
@@ -1824,6 +1845,13 @@
         </w:rPr>
         <w:t>In : 5ème édition des Journées Scientifiques du CAMES (Centre africain d’études supérieures en gestion (CESAG), Dakar (Sénégal), 06 au 09 décembre 2021)</w:t>
       </w:r>
+      <w:r>
+        <w:rPr>
+          <w:i/>
+          <w:highlight w:val="yellow"/>
+        </w:rPr>
+        <w:t xml:space="preserve"> [À COMPLÉTER : note/code et pagination à vérifier dans le livret des actes (type attesté : communication orale longue).]</w:t>
+      </w:r>
     </w:p>
     <w:p>
       <w:pPr>
@@ -1897,6 +1925,13 @@
         </w:rPr>
         <w:t>In : 5ème édition des Journées Scientifiques du CAMES (Centre africain d’études supérieures en gestion (CESAG), Dakar (Sénégal), 06 au 09 décembre 2021)</w:t>
       </w:r>
+      <w:r>
+        <w:rPr>
+          <w:i/>
+          <w:highlight w:val="yellow"/>
+        </w:rPr>
+        <w:t xml:space="preserve"> [À COMPLÉTER : note/code et pagination à vérifier dans le livret des actes (type attesté : communication orale longue).]</w:t>
+      </w:r>
     </w:p>
     <w:p>
       <w:pPr>
@@ -1970,6 +2005,13 @@
         </w:rPr>
         <w:t>In : 5ème édition des Journées Scientifiques du CAMES (Centre africain d’études supérieures en gestion (CESAG), Dakar (Sénégal), 06 au 09 décembre 2021)</w:t>
       </w:r>
+      <w:r>
+        <w:rPr>
+          <w:i/>
+          <w:highlight w:val="yellow"/>
+        </w:rPr>
+        <w:t xml:space="preserve"> [À COMPLÉTER : note/code et pagination à vérifier dans le livret des actes (type attesté : communication orale longue).]</w:t>
+      </w:r>
     </w:p>
     <w:p>
       <w:pPr>
@@ -2064,6 +2106,13 @@
         </w:rPr>
         <w:t>In : 4e Congrès international de la Société Béninoise de Cardiologie &amp; 3e Congrès international de l’Association des Sociétés de Cardiologie de l’Afrique de l’Ouest et du Centre (Palais des Congrès de Cotonou, Bénin, 05 au 07 décembre 2024)</w:t>
       </w:r>
+      <w:r>
+        <w:rPr>
+          <w:i/>
+          <w:highlight w:val="yellow"/>
+        </w:rPr>
+        <w:t xml:space="preserve"> [À COMPLÉTER : note/code et pagination à vérifier dans le livret des actes (non trouvés dans l’attestation de conférence).]</w:t>
+      </w:r>
     </w:p>
     <w:p>
       <w:pPr>
@@ -2158,6 +2207,13 @@
         </w:rPr>
         <w:t>In : Atelier sous-régional des programmes Terres nourricières et Promotion de l’agriculture familiale en Afrique de l’Ouest (Pafao), organisé par le CFSI et l’Oadel (Lomé, Togo, 04 au 06 novembre 2025)</w:t>
       </w:r>
+      <w:r>
+        <w:rPr>
+          <w:i/>
+          <w:highlight w:val="yellow"/>
+        </w:rPr>
+        <w:t xml:space="preserve"> [À COMPLÉTER : note/code et pagination à vérifier dans le livret des actes.]</w:t>
+      </w:r>
     </w:p>
     <w:p>
       <w:pPr>
@@ -2231,6 +2287,13 @@
         </w:rPr>
         <w:t>In : Atelier sous-régional des programmes Terres nourricières et Promotion de l’agriculture familiale en Afrique de l’Ouest (Pafao), organisé par le CFSI et l’Oadel (Lomé, Togo, 04 au 06 novembre 2025)</w:t>
       </w:r>
+      <w:r>
+        <w:rPr>
+          <w:i/>
+          <w:highlight w:val="yellow"/>
+        </w:rPr>
+        <w:t xml:space="preserve"> [À COMPLÉTER : note/code et pagination à vérifier dans le livret des actes.]</w:t>
+      </w:r>
     </w:p>
     <w:p>
       <w:pPr>
@@ -2304,6 +2367,13 @@
         </w:rPr>
         <w:t>In : Atelier sous-régional des programmes Terres nourricières et Promotion de l’agriculture familiale en Afrique de l’Ouest (Pafao), organisé par le CFSI et l’Oadel (Lomé, Togo, 04 au 06 novembre 2025)</w:t>
       </w:r>
+      <w:r>
+        <w:rPr>
+          <w:i/>
+          <w:highlight w:val="yellow"/>
+        </w:rPr>
+        <w:t xml:space="preserve"> [À COMPLÉTER : note/code et pagination à vérifier dans le livret des actes.]</w:t>
+      </w:r>
     </w:p>
     <w:p>
       <w:pPr>
@@ -2420,6 +2490,13 @@
         </w:rPr>
         <w:t>In : 5èmes Journées Scientifiques de l’Institut Régional de Santé Publique Comlan Alfred QUENUM (Ouidah (Bénin), 1er et 2 décembre 2022)</w:t>
       </w:r>
+      <w:r>
+        <w:rPr>
+          <w:i/>
+          <w:highlight w:val="yellow"/>
+        </w:rPr>
+        <w:t xml:space="preserve"> [Pagination à vérifier dans le livret correspondant (ID de l’attestation : 9472070108).]</w:t>
+      </w:r>
     </w:p>
     <w:p>
       <w:pPr>
@@ -2493,6 +2570,13 @@
         </w:rPr>
         <w:t>In : 5èmes Journées Scientifiques de l’Institut Régional de Santé Publique Comlan Alfred QUENUM (Ouidah (Bénin), 1er et 2 décembre 2022)</w:t>
       </w:r>
+      <w:r>
+        <w:rPr>
+          <w:i/>
+          <w:highlight w:val="yellow"/>
+        </w:rPr>
+        <w:t xml:space="preserve"> [Pagination à vérifier dans le livret correspondant (ID de l’attestation : 5422144359).]</w:t>
+      </w:r>
     </w:p>
     <w:p>
       <w:pPr>
@@ -2566,6 +2650,13 @@
         </w:rPr>
         <w:t>In : 5èmes Journées Scientifiques de l’Institut Régional de Santé Publique Comlan Alfred QUENUM (Ouidah (Bénin), 1er et 2 décembre 2022)</w:t>
       </w:r>
+      <w:r>
+        <w:rPr>
+          <w:i/>
+          <w:highlight w:val="yellow"/>
+        </w:rPr>
+        <w:t xml:space="preserve"> [Pagination à vérifier dans le livret correspondant (ID de l’attestation : 3609151358).]</w:t>
+      </w:r>
     </w:p>
     <w:p>
       <w:pPr>
@@ -2639,6 +2730,13 @@
         </w:rPr>
         <w:t>In : 5èmes Journées Scientifiques de l’Institut Régional de Santé Publique Comlan Alfred QUENUM (Ouidah (Bénin), 1er et 2 décembre 2022)</w:t>
       </w:r>
+      <w:r>
+        <w:rPr>
+          <w:i/>
+          <w:highlight w:val="yellow"/>
+        </w:rPr>
+        <w:t xml:space="preserve"> [Pagination à vérifier dans le livret correspondant (ID de l’attestation : 8968688003).]</w:t>
+      </w:r>
     </w:p>
     <w:p>
       <w:pPr>
@@ -2733,6 +2831,13 @@
         </w:rPr>
         <w:t>In : 3èmes Journées Scientifiques des Sciences de la Santé (CO51, Faculté des Sciences de la Santé, Cotonou (Bénin), 1er au 5 octobre 2024)</w:t>
       </w:r>
+      <w:r>
+        <w:rPr>
+          <w:i/>
+          <w:highlight w:val="yellow"/>
+        </w:rPr>
+        <w:t xml:space="preserve"> [Pagination à vérifier dans le livret correspondant (code CO51 déjà indiqué).]</w:t>
+      </w:r>
     </w:p>
     <w:p>
       <w:pPr>
@@ -2806,6 +2911,13 @@
         </w:rPr>
         <w:t>In : 3èmes Journées Scientifiques des Sciences de la Santé (CO52, Faculté des Sciences de la Santé, Cotonou (Bénin), 1er au 5 octobre 2024)</w:t>
       </w:r>
+      <w:r>
+        <w:rPr>
+          <w:i/>
+          <w:highlight w:val="yellow"/>
+        </w:rPr>
+        <w:t xml:space="preserve"> [Pagination à vérifier dans le livret correspondant (code CO52 déjà indiqué).]</w:t>
+      </w:r>
     </w:p>
     <w:p>
       <w:pPr>
@@ -2899,6 +3011,13 @@
           <w:sz w:val="26"/>
         </w:rPr>
         <w:t>In : 4èmes Journées Scientifiques des Sciences de la Santé (Cotonou (Bénin), 23 au 27 septembre 2025)</w:t>
+      </w:r>
+      <w:r>
+        <w:rPr>
+          <w:i/>
+          <w:highlight w:val="yellow"/>
+        </w:rPr>
+        <w:t xml:space="preserve"> [À COMPLÉTER : note/code et pagination à vérifier dans le livret des actes.]</w:t>
       </w:r>
     </w:p>
     <w:p>

</xml_diff>

<commit_message>
Add pagination from newly added proceedings
Co-authored-by: arena-agent <297053741+arena-agent@users.noreply.github.com>
</commit_message>
<xml_diff>
--- a/Liste communications .docx
+++ b/Liste communications .docx
@@ -2102,16 +2102,8 @@
       <w:r>
         <w:rPr>
           <w:i/>
-          <w:sz w:val="26"/>
-        </w:rPr>
-        <w:t>In : 4e Congrès international de la Société Béninoise de Cardiologie &amp; 3e Congrès international de l’Association des Sociétés de Cardiologie de l’Afrique de l’Ouest et du Centre (Palais des Congrès de Cotonou, Bénin, 05 au 07 décembre 2024)</w:t>
-      </w:r>
-      <w:r>
-        <w:rPr>
-          <w:i/>
-          <w:highlight w:val="yellow"/>
-        </w:rPr>
-        <w:t xml:space="preserve"> [À COMPLÉTER : note/code et pagination à vérifier dans le livret des actes (non trouvés dans l’attestation de conférence).]</w:t>
+        </w:rPr>
+        <w:t>In : 4e Congrès international de la Société Béninoise de Cardiologie &amp; 3e Congrès international de l’Association des Sociétés de Cardiologie de l’Afrique de l’Ouest et du Centre (Palais des Congrès de Cotonou, Bénin, 05 au 07 décembre 2024), code CF23, Livre des Résumés, p. 23.</w:t>
       </w:r>
     </w:p>
     <w:p>
@@ -3049,6 +3041,9 @@
           <w:u w:val="single"/>
         </w:rPr>
       </w:pPr>
+      <w:r>
+        <w:t>Année : 2026</w:t>
+      </w:r>
     </w:p>
     <w:sdt>
       <w:sdtPr>
@@ -3390,6 +3385,51 @@
         </w:p>
       </w:sdtContent>
     </w:sdt>
+    <w:p>
+      <w:pPr/>
+      <w:r>
+        <w:t>Auteur : AZANDJEME Colette Sylvie</w:t>
+      </w:r>
+    </w:p>
+    <w:p>
+      <w:pPr/>
+      <w:r>
+        <w:t>Titre de la communication : De la prévention à la prise en charge de la malnutrition et des maladies métaboliques : recommandations issues de 12 travaux au Bénin</w:t>
+      </w:r>
+    </w:p>
+    <w:p>
+      <w:pPr/>
+      <w:r>
+        <w:rPr>
+          <w:i/>
+        </w:rPr>
+        <w:t>In : 1ère Conférence KNOSA-Bénin (IRSP-CAQ, Ouidah, Bénin, 8 au 11 septembre 2026), code KS-04, Programme général, p. 11.</w:t>
+      </w:r>
+    </w:p>
+    <w:p>
+      <w:pPr/>
+    </w:p>
+    <w:p>
+      <w:pPr/>
+      <w:r>
+        <w:t>Auteur : AZANDJEME Colette Sylvie</w:t>
+      </w:r>
+    </w:p>
+    <w:p>
+      <w:pPr/>
+      <w:r>
+        <w:t>Titre de la communication : Optimisation de la performance du système de santé dans la prévention contre le paludisme chez les femmes et les enfants de moins de 5 ans : Enseignements issus de sept (07) travaux opérationnels au Bénin</w:t>
+      </w:r>
+    </w:p>
+    <w:p>
+      <w:pPr/>
+      <w:r>
+        <w:rPr>
+          <w:i/>
+        </w:rPr>
+        <w:t>In : 1ère Conférence KNOSA-Bénin (IRSP-CAQ, Ouidah, Bénin, 8 au 11 septembre 2026), code KPS-04, Programme général, p. 24.</w:t>
+      </w:r>
+    </w:p>
     <w:sectPr>
       <w:pgSz w:w="11906" w:h="16838"/>
       <w:pgMar w:top="1440" w:right="1440" w:bottom="1440" w:left="1440" w:header="708" w:footer="708" w:gutter="0"/>

</xml_diff>

<commit_message>
Complete communication references and presentations
Co-authored-by: arena-agent <297053741+arena-agent@users.noreply.github.com>
</commit_message>
<xml_diff>
--- a/Liste communications .docx
+++ b/Liste communications .docx
@@ -268,9 +268,8 @@
       <w:r>
         <w:rPr>
           <w:i/>
-          <w:highlight w:val="yellow"/>
-        </w:rPr>
-        <w:t xml:space="preserve"> [À COMPLÉTER : livret source, note/code et pagination à rechercher.]</w:t>
+        </w:rPr>
+        <w:t>Programme scientifique et résumés des communications, 4èmes Journées Scientifiques de l’Institut Régional de Santé Publique Comlan Alfred Quenum (Ouidah, Bénin, 3–4 décembre 2020), conférence de la séance plénière du 4 décembre, p. 10.</w:t>
       </w:r>
     </w:p>
     <w:sdt>
@@ -2384,6 +2383,243 @@
     </w:p>
     <w:p>
       <w:pPr>
+        <w:tabs>
+          <w:tab w:val="left" w:pos="2082"/>
+        </w:tabs>
+        <w:spacing w:line="240" w:lineRule="auto"/>
+        <w:ind w:firstLine="0"/>
+        <w:jc w:val="left"/>
+        <w:rPr>
+          <w:iCs/>
+          <w:sz w:val="26"/>
+          <w:szCs w:val="26"/>
+        </w:rPr>
+      </w:pPr>
+      <w:r>
+        <w:rPr>
+          <w:sz w:val="26"/>
+        </w:rPr>
+        <w:t>Année : 2026</w:t>
+      </w:r>
+    </w:p>
+    <w:p>
+      <w:pPr>
+        <w:spacing w:line="240" w:lineRule="auto"/>
+        <w:ind w:firstLine="0"/>
+        <w:jc w:val="left"/>
+        <w:rPr>
+          <w:iCs/>
+          <w:sz w:val="26"/>
+          <w:szCs w:val="26"/>
+        </w:rPr>
+      </w:pPr>
+      <w:r>
+        <w:rPr>
+          <w:iCs/>
+          <w:sz w:val="26"/>
+          <w:szCs w:val="26"/>
+        </w:rPr>
+        <w:t>Auteurs : Azandjeme Colette Sylvie, Halogla Joseph, Metonnou Clémence</w:t>
+      </w:r>
+      <w:r>
+        <w:rPr>
+          <w:iCs/>
+          <w:sz w:val="26"/>
+          <w:szCs w:val="26"/>
+        </w:rPr>
+      </w:r>
+      <w:r>
+        <w:rPr>
+          <w:iCs/>
+          <w:sz w:val="26"/>
+          <w:szCs w:val="26"/>
+        </w:rPr>
+      </w:r>
+    </w:p>
+    <w:p>
+      <w:pPr>
+        <w:spacing w:line="240" w:lineRule="auto"/>
+        <w:ind w:firstLine="0"/>
+        <w:jc w:val="left"/>
+        <w:rPr>
+          <w:iCs/>
+          <w:sz w:val="26"/>
+          <w:szCs w:val="26"/>
+        </w:rPr>
+      </w:pPr>
+      <w:r>
+        <w:rPr>
+          <w:iCs/>
+          <w:sz w:val="26"/>
+          <w:szCs w:val="26"/>
+        </w:rPr>
+        <w:t>Titre de la communication : EVALUATION OF THE PERFORMANCE OF OUTPATIENT NUTRITION CENTERS IN THE MANAGEMENT OF MALNUTRITION OF CHILDREN UNDER 5 YEARS OF AGE IN A HEALTH ZONE IN NORTHERN BENIN</w:t>
+      </w:r>
+    </w:p>
+    <w:p>
+      <w:pPr>
+        <w:spacing w:line="240" w:lineRule="auto"/>
+        <w:ind w:firstLine="0"/>
+        <w:jc w:val="left"/>
+        <w:rPr>
+          <w:b/>
+          <w:bCs/>
+          <w:i/>
+          <w:iCs/>
+          <w:sz w:val="26"/>
+          <w:szCs w:val="26"/>
+        </w:rPr>
+      </w:pPr>
+      <w:r>
+        <w:rPr>
+          <w:i/>
+          <w:sz w:val="26"/>
+          <w:szCs w:val="26"/>
+        </w:rPr>
+        <w:t xml:space="preserve">In : </w:t>
+      </w:r>
+      <w:sdt>
+        <w:sdtPr>
+          <w:rPr>
+            <w:i/>
+            <w:sz w:val="26"/>
+            <w:szCs w:val="26"/>
+          </w:rPr>
+          <w:id w:val="2041938789"/>
+          <w:placeholder>
+            <w:docPart w:val="6E58297A3137714D9B935301E935CC5D"/>
+          </w:placeholder>
+        </w:sdtPr>
+        <w:sdtContent>
+          <w:r>
+            <w:rPr>
+              <w:iCs/>
+              <w:sz w:val="26"/>
+              <w:szCs w:val="26"/>
+            </w:rPr>
+            <w:t xml:space="preserve">AZANDJEME Colette </w:t>
+          </w:r>
+          <w:proofErr w:type="gramStart"/>
+          <w:r>
+            <w:rPr>
+              <w:iCs/>
+              <w:sz w:val="26"/>
+              <w:szCs w:val="26"/>
+            </w:rPr>
+            <w:t xml:space="preserve">Sylvie </w:t>
+          </w:r>
+          <w:r>
+            <w:rPr>
+              <w:iCs/>
+              <w:sz w:val="26"/>
+              <w:szCs w:val="26"/>
+            </w:rPr>
+            <w:t xml:space="preserve"> </w:t>
+          </w:r>
+          <w:r>
+            <w:rPr>
+              <w:i/>
+              <w:sz w:val="26"/>
+              <w:szCs w:val="26"/>
+            </w:rPr>
+            <w:t>(</w:t>
+          </w:r>
+          <w:proofErr w:type="gramEnd"/>
+          <w:r>
+            <w:rPr>
+              <w:i/>
+              <w:sz w:val="26"/>
+              <w:szCs w:val="26"/>
+            </w:rPr>
+            <w:t>4eme</w:t>
+          </w:r>
+          <w:r>
+            <w:rPr>
+              <w:i/>
+              <w:sz w:val="26"/>
+              <w:szCs w:val="26"/>
+            </w:rPr>
+            <w:t xml:space="preserve">, </w:t>
+          </w:r>
+          <w:r>
+            <w:rPr>
+              <w:i/>
+              <w:sz w:val="26"/>
+              <w:szCs w:val="26"/>
+            </w:rPr>
+            <w:t xml:space="preserve">Institut Régionale de Santé Publique </w:t>
+          </w:r>
+          <w:proofErr w:type="spellStart"/>
+          <w:r>
+            <w:rPr>
+              <w:i/>
+              <w:sz w:val="26"/>
+              <w:szCs w:val="26"/>
+            </w:rPr>
+            <w:t>Comlan</w:t>
+          </w:r>
+          <w:proofErr w:type="spellEnd"/>
+          <w:r>
+            <w:rPr>
+              <w:i/>
+              <w:sz w:val="26"/>
+              <w:szCs w:val="26"/>
+            </w:rPr>
+            <w:t xml:space="preserve"> Alfred </w:t>
+          </w:r>
+          <w:proofErr w:type="spellStart"/>
+          <w:r>
+            <w:rPr>
+              <w:i/>
+              <w:sz w:val="26"/>
+              <w:szCs w:val="26"/>
+            </w:rPr>
+            <w:t>Quenum</w:t>
+          </w:r>
+          <w:proofErr w:type="spellEnd"/>
+          <w:r>
+            <w:rPr>
+              <w:i/>
+              <w:sz w:val="26"/>
+              <w:szCs w:val="26"/>
+            </w:rPr>
+            <w:t xml:space="preserve"> </w:t>
+          </w:r>
+          <w:r>
+            <w:rPr>
+              <w:i/>
+              <w:sz w:val="26"/>
+              <w:szCs w:val="26"/>
+            </w:rPr>
+            <w:t xml:space="preserve">, </w:t>
+          </w:r>
+          <w:r>
+            <w:rPr>
+              <w:i/>
+              <w:sz w:val="26"/>
+              <w:szCs w:val="26"/>
+            </w:rPr>
+            <w:t>3 au 4 décembre 2020</w:t>
+          </w:r>
+          <w:r>
+            <w:rPr>
+              <w:i/>
+              <w:sz w:val="26"/>
+              <w:szCs w:val="26"/>
+            </w:rPr>
+            <w:t>)</w:t>
+          </w:r>
+        </w:sdtContent>
+      </w:sdt>
+      <w:r>
+        <w:rPr>
+          <w:i/>
+        </w:rPr>
+        <w:t>Certificate of Abstract Presentation, 48th ESPEN Congress (Berlin, Germany, 5–8 September 2026), ePoster display, ID PD030.</w:t>
+      </w:r>
+    </w:p>
+    <w:p>
+      <w:pPr>
         <w:suppressAutoHyphens/>
         <w:spacing w:line="240" w:lineRule="auto"/>
         <w:ind w:right="146" w:firstLine="0"/>
@@ -2396,6 +2632,254 @@
           <w:u w:val="single"/>
         </w:rPr>
       </w:pPr>
+      <w:r/>
+    </w:p>
+    <w:p>
+      <w:pPr>
+        <w:spacing w:line="240" w:lineRule="auto"/>
+        <w:ind w:firstLine="0"/>
+        <w:jc w:val="left"/>
+        <w:rPr>
+          <w:iCs/>
+          <w:sz w:val="26"/>
+          <w:szCs w:val="26"/>
+        </w:rPr>
+      </w:pPr>
+      <w:r>
+        <w:rPr>
+          <w:iCs/>
+          <w:sz w:val="26"/>
+          <w:szCs w:val="26"/>
+        </w:rPr>
+        <w:t>Auteurs : Azandjeme Colette Sylvie, Houssou Gbèmahon, Fanou Nadia, Akpo Djenontin Opportune, Metonnou Clémence, Sossa Charles Jérôme, Compaoré Ella, Mongbo Roch</w:t>
+      </w:r>
+      <w:r>
+        <w:rPr>
+          <w:iCs/>
+          <w:sz w:val="26"/>
+          <w:szCs w:val="26"/>
+        </w:rPr>
+      </w:r>
+      <w:r>
+        <w:rPr>
+          <w:iCs/>
+          <w:sz w:val="26"/>
+          <w:szCs w:val="26"/>
+        </w:rPr>
+      </w:r>
+    </w:p>
+    <w:p>
+      <w:pPr>
+        <w:spacing w:line="240" w:lineRule="auto"/>
+        <w:ind w:firstLine="0"/>
+        <w:jc w:val="left"/>
+        <w:rPr>
+          <w:iCs/>
+          <w:sz w:val="26"/>
+          <w:szCs w:val="26"/>
+        </w:rPr>
+      </w:pPr>
+      <w:r>
+        <w:rPr>
+          <w:iCs/>
+          <w:sz w:val="26"/>
+          <w:szCs w:val="26"/>
+        </w:rPr>
+        <w:t>Titre de la communication : EFFECTS OF A NUTRITIONAL SUPPORT INTERVENTION FOR PREGNANT WOMEN TO PREVENT LOW-BIRTH-WEIGHT</w:t>
+      </w:r>
+    </w:p>
+    <w:p>
+      <w:pPr>
+        <w:spacing w:line="240" w:lineRule="auto"/>
+        <w:ind w:firstLine="0"/>
+        <w:jc w:val="left"/>
+        <w:rPr>
+          <w:b/>
+          <w:bCs/>
+          <w:i/>
+          <w:iCs/>
+          <w:sz w:val="26"/>
+          <w:szCs w:val="26"/>
+        </w:rPr>
+      </w:pPr>
+      <w:r>
+        <w:rPr>
+          <w:i/>
+          <w:sz w:val="26"/>
+          <w:szCs w:val="26"/>
+        </w:rPr>
+        <w:t xml:space="preserve">In : </w:t>
+      </w:r>
+      <w:sdt>
+        <w:sdtPr>
+          <w:rPr>
+            <w:i/>
+            <w:sz w:val="26"/>
+            <w:szCs w:val="26"/>
+          </w:rPr>
+          <w:id w:val="2041938789"/>
+          <w:placeholder>
+            <w:docPart w:val="6E58297A3137714D9B935301E935CC5D"/>
+          </w:placeholder>
+        </w:sdtPr>
+        <w:sdtContent>
+          <w:r>
+            <w:rPr>
+              <w:iCs/>
+              <w:sz w:val="26"/>
+              <w:szCs w:val="26"/>
+            </w:rPr>
+            <w:t xml:space="preserve">AZANDJEME Colette </w:t>
+          </w:r>
+          <w:proofErr w:type="gramStart"/>
+          <w:r>
+            <w:rPr>
+              <w:iCs/>
+              <w:sz w:val="26"/>
+              <w:szCs w:val="26"/>
+            </w:rPr>
+            <w:t xml:space="preserve">Sylvie </w:t>
+          </w:r>
+          <w:r>
+            <w:rPr>
+              <w:iCs/>
+              <w:sz w:val="26"/>
+              <w:szCs w:val="26"/>
+            </w:rPr>
+            <w:t xml:space="preserve"> </w:t>
+          </w:r>
+          <w:r>
+            <w:rPr>
+              <w:i/>
+              <w:sz w:val="26"/>
+              <w:szCs w:val="26"/>
+            </w:rPr>
+            <w:t>(</w:t>
+          </w:r>
+          <w:proofErr w:type="gramEnd"/>
+          <w:r>
+            <w:rPr>
+              <w:i/>
+              <w:sz w:val="26"/>
+              <w:szCs w:val="26"/>
+            </w:rPr>
+            <w:t>4eme</w:t>
+          </w:r>
+          <w:r>
+            <w:rPr>
+              <w:i/>
+              <w:sz w:val="26"/>
+              <w:szCs w:val="26"/>
+            </w:rPr>
+            <w:t xml:space="preserve">, </w:t>
+          </w:r>
+          <w:r>
+            <w:rPr>
+              <w:i/>
+              <w:sz w:val="26"/>
+              <w:szCs w:val="26"/>
+            </w:rPr>
+            <w:t xml:space="preserve">Institut Régionale de Santé Publique </w:t>
+          </w:r>
+          <w:proofErr w:type="spellStart"/>
+          <w:r>
+            <w:rPr>
+              <w:i/>
+              <w:sz w:val="26"/>
+              <w:szCs w:val="26"/>
+            </w:rPr>
+            <w:t>Comlan</w:t>
+          </w:r>
+          <w:proofErr w:type="spellEnd"/>
+          <w:r>
+            <w:rPr>
+              <w:i/>
+              <w:sz w:val="26"/>
+              <w:szCs w:val="26"/>
+            </w:rPr>
+            <w:t xml:space="preserve"> Alfred </w:t>
+          </w:r>
+          <w:proofErr w:type="spellStart"/>
+          <w:r>
+            <w:rPr>
+              <w:i/>
+              <w:sz w:val="26"/>
+              <w:szCs w:val="26"/>
+            </w:rPr>
+            <w:t>Quenum</w:t>
+          </w:r>
+          <w:proofErr w:type="spellEnd"/>
+          <w:r>
+            <w:rPr>
+              <w:i/>
+              <w:sz w:val="26"/>
+              <w:szCs w:val="26"/>
+            </w:rPr>
+            <w:t xml:space="preserve"> </w:t>
+          </w:r>
+          <w:r>
+            <w:rPr>
+              <w:i/>
+              <w:sz w:val="26"/>
+              <w:szCs w:val="26"/>
+            </w:rPr>
+            <w:t xml:space="preserve">, </w:t>
+          </w:r>
+          <w:r>
+            <w:rPr>
+              <w:i/>
+              <w:sz w:val="26"/>
+              <w:szCs w:val="26"/>
+            </w:rPr>
+            <w:t>3 au 4 décembre 2020</w:t>
+          </w:r>
+          <w:r>
+            <w:rPr>
+              <w:i/>
+              <w:sz w:val="26"/>
+              <w:szCs w:val="26"/>
+            </w:rPr>
+            <w:t>)</w:t>
+          </w:r>
+        </w:sdtContent>
+      </w:sdt>
+      <w:r>
+        <w:rPr>
+          <w:i/>
+        </w:rPr>
+        <w:t>Certificate of Abstract Presentation, 48th ESPEN Congress (Berlin, Germany, 5–8 September 2026), ePoster display, ID PD069.</w:t>
+      </w:r>
+    </w:p>
+    <w:p>
+      <w:pPr>
+        <w:suppressAutoHyphens/>
+        <w:spacing w:line="240" w:lineRule="auto"/>
+        <w:ind w:right="146" w:firstLine="0"/>
+        <w:rPr>
+          <w:b/>
+          <w:color w:val="000000"/>
+          <w:spacing w:val="-1"/>
+          <w:sz w:val="26"/>
+          <w:szCs w:val="26"/>
+          <w:u w:val="single"/>
+        </w:rPr>
+      </w:pPr>
+      <w:r/>
+    </w:p>
+    <w:p>
+      <w:pPr>
+        <w:suppressAutoHyphens/>
+        <w:spacing w:line="240" w:lineRule="auto"/>
+        <w:ind w:right="146" w:firstLine="0"/>
+        <w:rPr>
+          <w:b/>
+          <w:color w:val="000000"/>
+          <w:spacing w:val="-1"/>
+          <w:sz w:val="26"/>
+          <w:szCs w:val="26"/>
+          <w:u w:val="single"/>
+        </w:rPr>
+      </w:pPr>
       <w:r>
         <w:rPr>
           <w:b/>
@@ -2422,43 +2906,61 @@
         <w:rPr>
           <w:sz w:val="26"/>
         </w:rPr>
-        <w:t>Année : 2022</w:t>
-      </w:r>
-    </w:p>
-    <w:p>
-      <w:pPr>
-        <w:spacing w:line="240" w:lineRule="auto"/>
-        <w:ind w:firstLine="0"/>
-        <w:jc w:val="left"/>
-        <w:rPr>
-          <w:iCs/>
-          <w:sz w:val="26"/>
-          <w:szCs w:val="26"/>
-        </w:rPr>
-      </w:pPr>
-      <w:r>
-        <w:rPr>
-          <w:sz w:val="26"/>
-        </w:rPr>
-        <w:t>Auteur : AZANDJEME Colette Sylvie</w:t>
-      </w:r>
-    </w:p>
-    <w:p>
-      <w:pPr>
-        <w:spacing w:line="240" w:lineRule="auto"/>
-        <w:ind w:firstLine="0"/>
-        <w:jc w:val="left"/>
-        <w:rPr>
-          <w:iCs/>
-          <w:sz w:val="26"/>
-          <w:szCs w:val="26"/>
-        </w:rPr>
-      </w:pPr>
-      <w:r>
-        <w:rPr>
-          <w:sz w:val="26"/>
-        </w:rPr>
-        <w:t>Titre de la communication : Dénutrition chez les patients en postopératoire de chirurgie digestive au CNHU-HKM et au CHUD-OP en 2022</w:t>
+        <w:t>Année : 2020</w:t>
+      </w:r>
+    </w:p>
+    <w:p>
+      <w:pPr>
+        <w:spacing w:line="240" w:lineRule="auto"/>
+        <w:ind w:firstLine="0"/>
+        <w:jc w:val="left"/>
+        <w:rPr>
+          <w:iCs/>
+          <w:sz w:val="26"/>
+          <w:szCs w:val="26"/>
+        </w:rPr>
+      </w:pPr>
+      <w:r>
+        <w:rPr>
+          <w:iCs/>
+          <w:sz w:val="26"/>
+          <w:szCs w:val="26"/>
+        </w:rPr>
+        <w:t>Auteurs : C. G. Metonnou-Adanhoume, C. S. Azandjeme, C. J. Sossa, G. E. Sopoh, M. N. Paraïso, I Bio Nigan, V. Agueh</w:t>
+      </w:r>
+      <w:r>
+        <w:rPr>
+          <w:iCs/>
+          <w:sz w:val="26"/>
+          <w:szCs w:val="26"/>
+        </w:rPr>
+      </w:r>
+      <w:r>
+        <w:rPr>
+          <w:iCs/>
+          <w:sz w:val="26"/>
+          <w:szCs w:val="26"/>
+        </w:rPr>
+      </w:r>
+    </w:p>
+    <w:p>
+      <w:pPr>
+        <w:spacing w:line="240" w:lineRule="auto"/>
+        <w:ind w:firstLine="0"/>
+        <w:jc w:val="left"/>
+        <w:rPr>
+          <w:iCs/>
+          <w:sz w:val="26"/>
+          <w:szCs w:val="26"/>
+        </w:rPr>
+      </w:pPr>
+      <w:r>
+        <w:rPr>
+          <w:iCs/>
+          <w:sz w:val="26"/>
+          <w:szCs w:val="26"/>
+        </w:rPr>
+        <w:t>Titre de la communication : Facteurs de risque comportementaux modifiables associés aux facteurs de risque biologiques chez les sujets à risque de diabète de type 2 au Bénin</w:t>
       </w:r>
     </w:p>
     <w:p>
@@ -2479,15 +2981,148 @@
         <w:rPr>
           <w:i/>
           <w:sz w:val="26"/>
-        </w:rPr>
-        <w:t>In : 5èmes Journées Scientifiques de l’Institut Régional de Santé Publique Comlan Alfred QUENUM (Ouidah (Bénin), 1er et 2 décembre 2022)</w:t>
-      </w:r>
-      <w:r>
-        <w:rPr>
-          <w:i/>
-          <w:highlight w:val="yellow"/>
-        </w:rPr>
-        <w:t xml:space="preserve"> [Pagination à vérifier dans le livret correspondant (ID de l’attestation : 9472070108).]</w:t>
+          <w:szCs w:val="26"/>
+        </w:rPr>
+        <w:t xml:space="preserve">In : </w:t>
+      </w:r>
+      <w:sdt>
+        <w:sdtPr>
+          <w:rPr>
+            <w:i/>
+            <w:sz w:val="26"/>
+            <w:szCs w:val="26"/>
+          </w:rPr>
+          <w:id w:val="2041938789"/>
+          <w:placeholder>
+            <w:docPart w:val="6E58297A3137714D9B935301E935CC5D"/>
+          </w:placeholder>
+        </w:sdtPr>
+        <w:sdtContent>
+          <w:r>
+            <w:rPr>
+              <w:iCs/>
+              <w:sz w:val="26"/>
+              <w:szCs w:val="26"/>
+            </w:rPr>
+            <w:t xml:space="preserve">AZANDJEME Colette </w:t>
+          </w:r>
+          <w:proofErr w:type="gramStart"/>
+          <w:r>
+            <w:rPr>
+              <w:iCs/>
+              <w:sz w:val="26"/>
+              <w:szCs w:val="26"/>
+            </w:rPr>
+            <w:t xml:space="preserve">Sylvie </w:t>
+          </w:r>
+          <w:r>
+            <w:rPr>
+              <w:iCs/>
+              <w:sz w:val="26"/>
+              <w:szCs w:val="26"/>
+            </w:rPr>
+            <w:t xml:space="preserve"> </w:t>
+          </w:r>
+          <w:r>
+            <w:rPr>
+              <w:i/>
+              <w:sz w:val="26"/>
+              <w:szCs w:val="26"/>
+            </w:rPr>
+            <w:t>(</w:t>
+          </w:r>
+          <w:proofErr w:type="gramEnd"/>
+          <w:r>
+            <w:rPr>
+              <w:i/>
+              <w:sz w:val="26"/>
+              <w:szCs w:val="26"/>
+            </w:rPr>
+            <w:t>4eme</w:t>
+          </w:r>
+          <w:r>
+            <w:rPr>
+              <w:i/>
+              <w:sz w:val="26"/>
+              <w:szCs w:val="26"/>
+            </w:rPr>
+            <w:t xml:space="preserve">, </w:t>
+          </w:r>
+          <w:r>
+            <w:rPr>
+              <w:i/>
+              <w:sz w:val="26"/>
+              <w:szCs w:val="26"/>
+            </w:rPr>
+            <w:t xml:space="preserve">Institut Régionale de Santé Publique </w:t>
+          </w:r>
+          <w:proofErr w:type="spellStart"/>
+          <w:r>
+            <w:rPr>
+              <w:i/>
+              <w:sz w:val="26"/>
+              <w:szCs w:val="26"/>
+            </w:rPr>
+            <w:t>Comlan</w:t>
+          </w:r>
+          <w:proofErr w:type="spellEnd"/>
+          <w:r>
+            <w:rPr>
+              <w:i/>
+              <w:sz w:val="26"/>
+              <w:szCs w:val="26"/>
+            </w:rPr>
+            <w:t xml:space="preserve"> Alfred </w:t>
+          </w:r>
+          <w:proofErr w:type="spellStart"/>
+          <w:r>
+            <w:rPr>
+              <w:i/>
+              <w:sz w:val="26"/>
+              <w:szCs w:val="26"/>
+            </w:rPr>
+            <w:t>Quenum</w:t>
+          </w:r>
+          <w:proofErr w:type="spellEnd"/>
+          <w:r>
+            <w:rPr>
+              <w:i/>
+              <w:sz w:val="26"/>
+              <w:szCs w:val="26"/>
+            </w:rPr>
+            <w:t xml:space="preserve"> </w:t>
+          </w:r>
+          <w:r>
+            <w:rPr>
+              <w:i/>
+              <w:sz w:val="26"/>
+              <w:szCs w:val="26"/>
+            </w:rPr>
+            <w:t xml:space="preserve">, </w:t>
+          </w:r>
+          <w:r>
+            <w:rPr>
+              <w:i/>
+              <w:sz w:val="26"/>
+              <w:szCs w:val="26"/>
+            </w:rPr>
+            <w:t>3 au 4 décembre 2020</w:t>
+          </w:r>
+          <w:r>
+            <w:rPr>
+              <w:i/>
+              <w:sz w:val="26"/>
+              <w:szCs w:val="26"/>
+            </w:rPr>
+            <w:t>)</w:t>
+          </w:r>
+        </w:sdtContent>
+      </w:sdt>
+      <w:r>
+        <w:rPr>
+          <w:i/>
+        </w:rPr>
+        <w:t>Programme scientifique et résumés des communications, 4èmes Journées Scientifiques de l’Institut Régional de Santé Publique Comlan Alfred Quenum (Ouidah, Bénin, 3–4 décembre 2020), code CL-CO-04, p. 153–154.</w:t>
       </w:r>
     </w:p>
     <w:p>
@@ -2504,41 +3139,81 @@
           <w:u w:val="single"/>
         </w:rPr>
       </w:pPr>
-    </w:p>
-    <w:p>
-      <w:pPr>
-        <w:spacing w:line="240" w:lineRule="auto"/>
-        <w:ind w:firstLine="0"/>
-        <w:jc w:val="left"/>
-        <w:rPr>
-          <w:iCs/>
-          <w:sz w:val="26"/>
-          <w:szCs w:val="26"/>
-        </w:rPr>
-      </w:pPr>
-      <w:r>
-        <w:rPr>
-          <w:sz w:val="26"/>
-        </w:rPr>
-        <w:t>Auteur : AZANDJEME Colette Sylvie</w:t>
-      </w:r>
-    </w:p>
-    <w:p>
-      <w:pPr>
-        <w:spacing w:line="240" w:lineRule="auto"/>
-        <w:ind w:firstLine="0"/>
-        <w:jc w:val="left"/>
-        <w:rPr>
-          <w:iCs/>
-          <w:sz w:val="26"/>
-          <w:szCs w:val="26"/>
-        </w:rPr>
-      </w:pPr>
-      <w:r>
-        <w:rPr>
-          <w:sz w:val="26"/>
-        </w:rPr>
-        <w:t>Titre de la communication : Profil nutritionnel des patients atteints d’hépatopathie chronique au CNHU-HKM de Cotonou</w:t>
+      <w:r/>
+    </w:p>
+    <w:p>
+      <w:pPr>
+        <w:tabs>
+          <w:tab w:val="left" w:pos="2082"/>
+        </w:tabs>
+        <w:spacing w:line="240" w:lineRule="auto"/>
+        <w:ind w:firstLine="0"/>
+        <w:jc w:val="left"/>
+        <w:rPr>
+          <w:iCs/>
+          <w:sz w:val="26"/>
+          <w:szCs w:val="26"/>
+        </w:rPr>
+      </w:pPr>
+      <w:r>
+        <w:rPr>
+          <w:sz w:val="26"/>
+        </w:rPr>
+        <w:t>Année : 2022</w:t>
+      </w:r>
+    </w:p>
+    <w:p>
+      <w:pPr>
+        <w:spacing w:line="240" w:lineRule="auto"/>
+        <w:ind w:firstLine="0"/>
+        <w:jc w:val="left"/>
+        <w:rPr>
+          <w:iCs/>
+          <w:sz w:val="26"/>
+          <w:szCs w:val="26"/>
+        </w:rPr>
+      </w:pPr>
+      <w:r>
+        <w:rPr>
+          <w:iCs/>
+          <w:sz w:val="26"/>
+          <w:szCs w:val="26"/>
+        </w:rPr>
+        <w:t>Auteurs : Gounongbé Ahoya Christophe Fabien, Mama Cissé I, Azandjèmè Colette</w:t>
+      </w:r>
+      <w:r>
+        <w:rPr>
+          <w:iCs/>
+          <w:sz w:val="26"/>
+          <w:szCs w:val="26"/>
+        </w:rPr>
+      </w:r>
+      <w:r>
+        <w:rPr>
+          <w:iCs/>
+          <w:sz w:val="26"/>
+          <w:szCs w:val="26"/>
+        </w:rPr>
+      </w:r>
+    </w:p>
+    <w:p>
+      <w:pPr>
+        <w:spacing w:line="240" w:lineRule="auto"/>
+        <w:ind w:firstLine="0"/>
+        <w:jc w:val="left"/>
+        <w:rPr>
+          <w:iCs/>
+          <w:sz w:val="26"/>
+          <w:szCs w:val="26"/>
+        </w:rPr>
+      </w:pPr>
+      <w:r>
+        <w:rPr>
+          <w:iCs/>
+          <w:sz w:val="26"/>
+          <w:szCs w:val="26"/>
+        </w:rPr>
+        <w:t>Titre de la communication : Profil des risques professionnels associés à la soudure de matières plastiques par brulage artisanal à Parakou en 2019</w:t>
       </w:r>
     </w:p>
     <w:p>
@@ -2559,15 +3234,148 @@
         <w:rPr>
           <w:i/>
           <w:sz w:val="26"/>
-        </w:rPr>
-        <w:t>In : 5èmes Journées Scientifiques de l’Institut Régional de Santé Publique Comlan Alfred QUENUM (Ouidah (Bénin), 1er et 2 décembre 2022)</w:t>
-      </w:r>
-      <w:r>
-        <w:rPr>
-          <w:i/>
-          <w:highlight w:val="yellow"/>
-        </w:rPr>
-        <w:t xml:space="preserve"> [Pagination à vérifier dans le livret correspondant (ID de l’attestation : 5422144359).]</w:t>
+          <w:szCs w:val="26"/>
+        </w:rPr>
+        <w:t xml:space="preserve">In : </w:t>
+      </w:r>
+      <w:sdt>
+        <w:sdtPr>
+          <w:rPr>
+            <w:i/>
+            <w:sz w:val="26"/>
+            <w:szCs w:val="26"/>
+          </w:rPr>
+          <w:id w:val="2041938789"/>
+          <w:placeholder>
+            <w:docPart w:val="6E58297A3137714D9B935301E935CC5D"/>
+          </w:placeholder>
+        </w:sdtPr>
+        <w:sdtContent>
+          <w:r>
+            <w:rPr>
+              <w:iCs/>
+              <w:sz w:val="26"/>
+              <w:szCs w:val="26"/>
+            </w:rPr>
+            <w:t xml:space="preserve">AZANDJEME Colette </w:t>
+          </w:r>
+          <w:proofErr w:type="gramStart"/>
+          <w:r>
+            <w:rPr>
+              <w:iCs/>
+              <w:sz w:val="26"/>
+              <w:szCs w:val="26"/>
+            </w:rPr>
+            <w:t xml:space="preserve">Sylvie </w:t>
+          </w:r>
+          <w:r>
+            <w:rPr>
+              <w:iCs/>
+              <w:sz w:val="26"/>
+              <w:szCs w:val="26"/>
+            </w:rPr>
+            <w:t xml:space="preserve"> </w:t>
+          </w:r>
+          <w:r>
+            <w:rPr>
+              <w:i/>
+              <w:sz w:val="26"/>
+              <w:szCs w:val="26"/>
+            </w:rPr>
+            <w:t>(</w:t>
+          </w:r>
+          <w:proofErr w:type="gramEnd"/>
+          <w:r>
+            <w:rPr>
+              <w:i/>
+              <w:sz w:val="26"/>
+              <w:szCs w:val="26"/>
+            </w:rPr>
+            <w:t>4eme</w:t>
+          </w:r>
+          <w:r>
+            <w:rPr>
+              <w:i/>
+              <w:sz w:val="26"/>
+              <w:szCs w:val="26"/>
+            </w:rPr>
+            <w:t xml:space="preserve">, </w:t>
+          </w:r>
+          <w:r>
+            <w:rPr>
+              <w:i/>
+              <w:sz w:val="26"/>
+              <w:szCs w:val="26"/>
+            </w:rPr>
+            <w:t xml:space="preserve">Institut Régionale de Santé Publique </w:t>
+          </w:r>
+          <w:proofErr w:type="spellStart"/>
+          <w:r>
+            <w:rPr>
+              <w:i/>
+              <w:sz w:val="26"/>
+              <w:szCs w:val="26"/>
+            </w:rPr>
+            <w:t>Comlan</w:t>
+          </w:r>
+          <w:proofErr w:type="spellEnd"/>
+          <w:r>
+            <w:rPr>
+              <w:i/>
+              <w:sz w:val="26"/>
+              <w:szCs w:val="26"/>
+            </w:rPr>
+            <w:t xml:space="preserve"> Alfred </w:t>
+          </w:r>
+          <w:proofErr w:type="spellStart"/>
+          <w:r>
+            <w:rPr>
+              <w:i/>
+              <w:sz w:val="26"/>
+              <w:szCs w:val="26"/>
+            </w:rPr>
+            <w:t>Quenum</w:t>
+          </w:r>
+          <w:proofErr w:type="spellEnd"/>
+          <w:r>
+            <w:rPr>
+              <w:i/>
+              <w:sz w:val="26"/>
+              <w:szCs w:val="26"/>
+            </w:rPr>
+            <w:t xml:space="preserve"> </w:t>
+          </w:r>
+          <w:r>
+            <w:rPr>
+              <w:i/>
+              <w:sz w:val="26"/>
+              <w:szCs w:val="26"/>
+            </w:rPr>
+            <w:t xml:space="preserve">, </w:t>
+          </w:r>
+          <w:r>
+            <w:rPr>
+              <w:i/>
+              <w:sz w:val="26"/>
+              <w:szCs w:val="26"/>
+            </w:rPr>
+            <w:t>3 au 4 décembre 2020</w:t>
+          </w:r>
+          <w:r>
+            <w:rPr>
+              <w:i/>
+              <w:sz w:val="26"/>
+              <w:szCs w:val="26"/>
+            </w:rPr>
+            <w:t>)</w:t>
+          </w:r>
+        </w:sdtContent>
+      </w:sdt>
+      <w:r>
+        <w:rPr>
+          <w:i/>
+        </w:rPr>
+        <w:t>Livre des résumés, 1ères Journées d’épidémiologie et de santé publique de l’Université de Parakou (JESP-UP, Parakou, Bénin, 6–7 mai 2022), code CO15, p. 31.</w:t>
       </w:r>
     </w:p>
     <w:p>
@@ -2584,41 +3392,60 @@
           <w:u w:val="single"/>
         </w:rPr>
       </w:pPr>
-    </w:p>
-    <w:p>
-      <w:pPr>
-        <w:spacing w:line="240" w:lineRule="auto"/>
-        <w:ind w:firstLine="0"/>
-        <w:jc w:val="left"/>
-        <w:rPr>
-          <w:iCs/>
-          <w:sz w:val="26"/>
-          <w:szCs w:val="26"/>
-        </w:rPr>
-      </w:pPr>
-      <w:r>
-        <w:rPr>
-          <w:sz w:val="26"/>
-        </w:rPr>
-        <w:t>Auteur : AZANDJEME Colette Sylvie</w:t>
-      </w:r>
-    </w:p>
-    <w:p>
-      <w:pPr>
-        <w:spacing w:line="240" w:lineRule="auto"/>
-        <w:ind w:firstLine="0"/>
-        <w:jc w:val="left"/>
-        <w:rPr>
-          <w:iCs/>
-          <w:sz w:val="26"/>
-          <w:szCs w:val="26"/>
-        </w:rPr>
-      </w:pPr>
-      <w:r>
-        <w:rPr>
-          <w:sz w:val="26"/>
-        </w:rPr>
-        <w:t>Titre de la communication : Habitudes de consommation des alicaments et facteurs associés dans la ville de Cotonou au Bénin</w:t>
+      <w:r/>
+    </w:p>
+    <w:p>
+      <w:pPr>
+        <w:spacing w:line="240" w:lineRule="auto"/>
+        <w:ind w:firstLine="0"/>
+        <w:jc w:val="left"/>
+        <w:rPr>
+          <w:iCs/>
+          <w:sz w:val="26"/>
+          <w:szCs w:val="26"/>
+        </w:rPr>
+      </w:pPr>
+      <w:r>
+        <w:rPr>
+          <w:iCs/>
+          <w:sz w:val="26"/>
+          <w:szCs w:val="26"/>
+        </w:rPr>
+        <w:t>Auteurs : Azandjeme Colette Sylvie, Davo Auriel, Aguemon Badirou, Metonnou Clémence Germaine, Mongbo Virginie, Bedie Vignon</w:t>
+      </w:r>
+      <w:r>
+        <w:rPr>
+          <w:iCs/>
+          <w:sz w:val="26"/>
+          <w:szCs w:val="26"/>
+        </w:rPr>
+      </w:r>
+      <w:r>
+        <w:rPr>
+          <w:iCs/>
+          <w:sz w:val="26"/>
+          <w:szCs w:val="26"/>
+        </w:rPr>
+      </w:r>
+    </w:p>
+    <w:p>
+      <w:pPr>
+        <w:spacing w:line="240" w:lineRule="auto"/>
+        <w:ind w:firstLine="0"/>
+        <w:jc w:val="left"/>
+        <w:rPr>
+          <w:iCs/>
+          <w:sz w:val="26"/>
+          <w:szCs w:val="26"/>
+        </w:rPr>
+      </w:pPr>
+      <w:r>
+        <w:rPr>
+          <w:iCs/>
+          <w:sz w:val="26"/>
+          <w:szCs w:val="26"/>
+        </w:rPr>
+        <w:t>Titre de la communication : Ampleur et facteurs associés au retard de croissance dans la commune de Dassa-Zoumè en 2021</w:t>
       </w:r>
     </w:p>
     <w:p>
@@ -2639,15 +3466,148 @@
         <w:rPr>
           <w:i/>
           <w:sz w:val="26"/>
-        </w:rPr>
-        <w:t>In : 5èmes Journées Scientifiques de l’Institut Régional de Santé Publique Comlan Alfred QUENUM (Ouidah (Bénin), 1er et 2 décembre 2022)</w:t>
-      </w:r>
-      <w:r>
-        <w:rPr>
-          <w:i/>
-          <w:highlight w:val="yellow"/>
-        </w:rPr>
-        <w:t xml:space="preserve"> [Pagination à vérifier dans le livret correspondant (ID de l’attestation : 3609151358).]</w:t>
+          <w:szCs w:val="26"/>
+        </w:rPr>
+        <w:t xml:space="preserve">In : </w:t>
+      </w:r>
+      <w:sdt>
+        <w:sdtPr>
+          <w:rPr>
+            <w:i/>
+            <w:sz w:val="26"/>
+            <w:szCs w:val="26"/>
+          </w:rPr>
+          <w:id w:val="2041938789"/>
+          <w:placeholder>
+            <w:docPart w:val="6E58297A3137714D9B935301E935CC5D"/>
+          </w:placeholder>
+        </w:sdtPr>
+        <w:sdtContent>
+          <w:r>
+            <w:rPr>
+              <w:iCs/>
+              <w:sz w:val="26"/>
+              <w:szCs w:val="26"/>
+            </w:rPr>
+            <w:t xml:space="preserve">AZANDJEME Colette </w:t>
+          </w:r>
+          <w:proofErr w:type="gramStart"/>
+          <w:r>
+            <w:rPr>
+              <w:iCs/>
+              <w:sz w:val="26"/>
+              <w:szCs w:val="26"/>
+            </w:rPr>
+            <w:t xml:space="preserve">Sylvie </w:t>
+          </w:r>
+          <w:r>
+            <w:rPr>
+              <w:iCs/>
+              <w:sz w:val="26"/>
+              <w:szCs w:val="26"/>
+            </w:rPr>
+            <w:t xml:space="preserve"> </w:t>
+          </w:r>
+          <w:r>
+            <w:rPr>
+              <w:i/>
+              <w:sz w:val="26"/>
+              <w:szCs w:val="26"/>
+            </w:rPr>
+            <w:t>(</w:t>
+          </w:r>
+          <w:proofErr w:type="gramEnd"/>
+          <w:r>
+            <w:rPr>
+              <w:i/>
+              <w:sz w:val="26"/>
+              <w:szCs w:val="26"/>
+            </w:rPr>
+            <w:t>4eme</w:t>
+          </w:r>
+          <w:r>
+            <w:rPr>
+              <w:i/>
+              <w:sz w:val="26"/>
+              <w:szCs w:val="26"/>
+            </w:rPr>
+            <w:t xml:space="preserve">, </w:t>
+          </w:r>
+          <w:r>
+            <w:rPr>
+              <w:i/>
+              <w:sz w:val="26"/>
+              <w:szCs w:val="26"/>
+            </w:rPr>
+            <w:t xml:space="preserve">Institut Régionale de Santé Publique </w:t>
+          </w:r>
+          <w:proofErr w:type="spellStart"/>
+          <w:r>
+            <w:rPr>
+              <w:i/>
+              <w:sz w:val="26"/>
+              <w:szCs w:val="26"/>
+            </w:rPr>
+            <w:t>Comlan</w:t>
+          </w:r>
+          <w:proofErr w:type="spellEnd"/>
+          <w:r>
+            <w:rPr>
+              <w:i/>
+              <w:sz w:val="26"/>
+              <w:szCs w:val="26"/>
+            </w:rPr>
+            <w:t xml:space="preserve"> Alfred </w:t>
+          </w:r>
+          <w:proofErr w:type="spellStart"/>
+          <w:r>
+            <w:rPr>
+              <w:i/>
+              <w:sz w:val="26"/>
+              <w:szCs w:val="26"/>
+            </w:rPr>
+            <w:t>Quenum</w:t>
+          </w:r>
+          <w:proofErr w:type="spellEnd"/>
+          <w:r>
+            <w:rPr>
+              <w:i/>
+              <w:sz w:val="26"/>
+              <w:szCs w:val="26"/>
+            </w:rPr>
+            <w:t xml:space="preserve"> </w:t>
+          </w:r>
+          <w:r>
+            <w:rPr>
+              <w:i/>
+              <w:sz w:val="26"/>
+              <w:szCs w:val="26"/>
+            </w:rPr>
+            <w:t xml:space="preserve">, </w:t>
+          </w:r>
+          <w:r>
+            <w:rPr>
+              <w:i/>
+              <w:sz w:val="26"/>
+              <w:szCs w:val="26"/>
+            </w:rPr>
+            <w:t>3 au 4 décembre 2020</w:t>
+          </w:r>
+          <w:r>
+            <w:rPr>
+              <w:i/>
+              <w:sz w:val="26"/>
+              <w:szCs w:val="26"/>
+            </w:rPr>
+            <w:t>)</w:t>
+          </w:r>
+        </w:sdtContent>
+      </w:sdt>
+      <w:r>
+        <w:rPr>
+          <w:i/>
+        </w:rPr>
+        <w:t>Livre des résumés, 1ères Journées d’épidémiologie et de santé publique de l’Université de Parakou (JESP-UP, Parakou, Bénin, 6–7 mai 2022), code COD42, p. 71.</w:t>
       </w:r>
     </w:p>
     <w:p>
@@ -2664,41 +3624,60 @@
           <w:u w:val="single"/>
         </w:rPr>
       </w:pPr>
-    </w:p>
-    <w:p>
-      <w:pPr>
-        <w:spacing w:line="240" w:lineRule="auto"/>
-        <w:ind w:firstLine="0"/>
-        <w:jc w:val="left"/>
-        <w:rPr>
-          <w:iCs/>
-          <w:sz w:val="26"/>
-          <w:szCs w:val="26"/>
-        </w:rPr>
-      </w:pPr>
-      <w:r>
-        <w:rPr>
-          <w:sz w:val="26"/>
-        </w:rPr>
-        <w:t>Auteur : AZANDJEME Colette Sylvie</w:t>
-      </w:r>
-    </w:p>
-    <w:p>
-      <w:pPr>
-        <w:spacing w:line="240" w:lineRule="auto"/>
-        <w:ind w:firstLine="0"/>
-        <w:jc w:val="left"/>
-        <w:rPr>
-          <w:iCs/>
-          <w:sz w:val="26"/>
-          <w:szCs w:val="26"/>
-        </w:rPr>
-      </w:pPr>
-      <w:r>
-        <w:rPr>
-          <w:sz w:val="26"/>
-        </w:rPr>
-        <w:t>Titre de la communication : Évaluation de la qualité des soins nutritionnels chez l’enfant hospitalisé au CHU-MEL en 2022</w:t>
+      <w:r/>
+    </w:p>
+    <w:p>
+      <w:pPr>
+        <w:spacing w:line="240" w:lineRule="auto"/>
+        <w:ind w:firstLine="0"/>
+        <w:jc w:val="left"/>
+        <w:rPr>
+          <w:iCs/>
+          <w:sz w:val="26"/>
+          <w:szCs w:val="26"/>
+        </w:rPr>
+      </w:pPr>
+      <w:r>
+        <w:rPr>
+          <w:iCs/>
+          <w:sz w:val="26"/>
+          <w:szCs w:val="26"/>
+        </w:rPr>
+        <w:t>Auteurs : Azandjeme Colette Sylvie, Davo Auriel, Aguemon Badirou, Metonnou Clémence Germaine, Mongbo Virginie, Bedie Vignon</w:t>
+      </w:r>
+      <w:r>
+        <w:rPr>
+          <w:iCs/>
+          <w:sz w:val="26"/>
+          <w:szCs w:val="26"/>
+        </w:rPr>
+      </w:r>
+      <w:r>
+        <w:rPr>
+          <w:iCs/>
+          <w:sz w:val="26"/>
+          <w:szCs w:val="26"/>
+        </w:rPr>
+      </w:r>
+    </w:p>
+    <w:p>
+      <w:pPr>
+        <w:spacing w:line="240" w:lineRule="auto"/>
+        <w:ind w:firstLine="0"/>
+        <w:jc w:val="left"/>
+        <w:rPr>
+          <w:iCs/>
+          <w:sz w:val="26"/>
+          <w:szCs w:val="26"/>
+        </w:rPr>
+      </w:pPr>
+      <w:r>
+        <w:rPr>
+          <w:iCs/>
+          <w:sz w:val="26"/>
+          <w:szCs w:val="26"/>
+        </w:rPr>
+        <w:t>Titre de la communication : Facteurs associés au retard de croissance dans la commune de Dassa-Zoumè en 2021</w:t>
       </w:r>
     </w:p>
     <w:p>
@@ -2719,15 +3698,148 @@
         <w:rPr>
           <w:i/>
           <w:sz w:val="26"/>
-        </w:rPr>
-        <w:t>In : 5èmes Journées Scientifiques de l’Institut Régional de Santé Publique Comlan Alfred QUENUM (Ouidah (Bénin), 1er et 2 décembre 2022)</w:t>
-      </w:r>
-      <w:r>
-        <w:rPr>
-          <w:i/>
-          <w:highlight w:val="yellow"/>
-        </w:rPr>
-        <w:t xml:space="preserve"> [Pagination à vérifier dans le livret correspondant (ID de l’attestation : 8968688003).]</w:t>
+          <w:szCs w:val="26"/>
+        </w:rPr>
+        <w:t xml:space="preserve">In : </w:t>
+      </w:r>
+      <w:sdt>
+        <w:sdtPr>
+          <w:rPr>
+            <w:i/>
+            <w:sz w:val="26"/>
+            <w:szCs w:val="26"/>
+          </w:rPr>
+          <w:id w:val="2041938789"/>
+          <w:placeholder>
+            <w:docPart w:val="6E58297A3137714D9B935301E935CC5D"/>
+          </w:placeholder>
+        </w:sdtPr>
+        <w:sdtContent>
+          <w:r>
+            <w:rPr>
+              <w:iCs/>
+              <w:sz w:val="26"/>
+              <w:szCs w:val="26"/>
+            </w:rPr>
+            <w:t xml:space="preserve">AZANDJEME Colette </w:t>
+          </w:r>
+          <w:proofErr w:type="gramStart"/>
+          <w:r>
+            <w:rPr>
+              <w:iCs/>
+              <w:sz w:val="26"/>
+              <w:szCs w:val="26"/>
+            </w:rPr>
+            <w:t xml:space="preserve">Sylvie </w:t>
+          </w:r>
+          <w:r>
+            <w:rPr>
+              <w:iCs/>
+              <w:sz w:val="26"/>
+              <w:szCs w:val="26"/>
+            </w:rPr>
+            <w:t xml:space="preserve"> </w:t>
+          </w:r>
+          <w:r>
+            <w:rPr>
+              <w:i/>
+              <w:sz w:val="26"/>
+              <w:szCs w:val="26"/>
+            </w:rPr>
+            <w:t>(</w:t>
+          </w:r>
+          <w:proofErr w:type="gramEnd"/>
+          <w:r>
+            <w:rPr>
+              <w:i/>
+              <w:sz w:val="26"/>
+              <w:szCs w:val="26"/>
+            </w:rPr>
+            <w:t>4eme</w:t>
+          </w:r>
+          <w:r>
+            <w:rPr>
+              <w:i/>
+              <w:sz w:val="26"/>
+              <w:szCs w:val="26"/>
+            </w:rPr>
+            <w:t xml:space="preserve">, </w:t>
+          </w:r>
+          <w:r>
+            <w:rPr>
+              <w:i/>
+              <w:sz w:val="26"/>
+              <w:szCs w:val="26"/>
+            </w:rPr>
+            <w:t xml:space="preserve">Institut Régionale de Santé Publique </w:t>
+          </w:r>
+          <w:proofErr w:type="spellStart"/>
+          <w:r>
+            <w:rPr>
+              <w:i/>
+              <w:sz w:val="26"/>
+              <w:szCs w:val="26"/>
+            </w:rPr>
+            <w:t>Comlan</w:t>
+          </w:r>
+          <w:proofErr w:type="spellEnd"/>
+          <w:r>
+            <w:rPr>
+              <w:i/>
+              <w:sz w:val="26"/>
+              <w:szCs w:val="26"/>
+            </w:rPr>
+            <w:t xml:space="preserve"> Alfred </w:t>
+          </w:r>
+          <w:proofErr w:type="spellStart"/>
+          <w:r>
+            <w:rPr>
+              <w:i/>
+              <w:sz w:val="26"/>
+              <w:szCs w:val="26"/>
+            </w:rPr>
+            <w:t>Quenum</w:t>
+          </w:r>
+          <w:proofErr w:type="spellEnd"/>
+          <w:r>
+            <w:rPr>
+              <w:i/>
+              <w:sz w:val="26"/>
+              <w:szCs w:val="26"/>
+            </w:rPr>
+            <w:t xml:space="preserve"> </w:t>
+          </w:r>
+          <w:r>
+            <w:rPr>
+              <w:i/>
+              <w:sz w:val="26"/>
+              <w:szCs w:val="26"/>
+            </w:rPr>
+            <w:t xml:space="preserve">, </w:t>
+          </w:r>
+          <w:r>
+            <w:rPr>
+              <w:i/>
+              <w:sz w:val="26"/>
+              <w:szCs w:val="26"/>
+            </w:rPr>
+            <w:t>3 au 4 décembre 2020</w:t>
+          </w:r>
+          <w:r>
+            <w:rPr>
+              <w:i/>
+              <w:sz w:val="26"/>
+              <w:szCs w:val="26"/>
+            </w:rPr>
+            <w:t>)</w:t>
+          </w:r>
+        </w:sdtContent>
+      </w:sdt>
+      <w:r>
+        <w:rPr>
+          <w:i/>
+        </w:rPr>
+        <w:t>Livre des résumés, 1ères Journées d’épidémiologie et de santé publique de l’Université de Parakou (JESP-UP, Parakou, Bénin, 6–7 mai 2022), code COD43, p. 72–73.</w:t>
       </w:r>
     </w:p>
     <w:p>
@@ -2744,6 +3856,559 @@
           <w:u w:val="single"/>
         </w:rPr>
       </w:pPr>
+      <w:r/>
+    </w:p>
+    <w:p>
+      <w:pPr>
+        <w:spacing w:line="240" w:lineRule="auto"/>
+        <w:ind w:firstLine="0"/>
+        <w:jc w:val="left"/>
+        <w:rPr>
+          <w:iCs/>
+          <w:sz w:val="26"/>
+          <w:szCs w:val="26"/>
+        </w:rPr>
+      </w:pPr>
+      <w:r>
+        <w:rPr>
+          <w:iCs/>
+          <w:sz w:val="26"/>
+          <w:szCs w:val="26"/>
+        </w:rPr>
+        <w:t>Auteurs : Metonnou Clémence Germaine, Aguemon Badirou, Hounkpatin Ghislaine, Azandjeme Colette Sylvie, Sossa Charles</w:t>
+      </w:r>
+      <w:r>
+        <w:rPr>
+          <w:iCs/>
+          <w:sz w:val="26"/>
+          <w:szCs w:val="26"/>
+        </w:rPr>
+      </w:r>
+      <w:r>
+        <w:rPr>
+          <w:iCs/>
+          <w:sz w:val="26"/>
+          <w:szCs w:val="26"/>
+        </w:rPr>
+      </w:r>
+    </w:p>
+    <w:p>
+      <w:pPr>
+        <w:spacing w:line="240" w:lineRule="auto"/>
+        <w:ind w:firstLine="0"/>
+        <w:jc w:val="left"/>
+        <w:rPr>
+          <w:iCs/>
+          <w:sz w:val="26"/>
+          <w:szCs w:val="26"/>
+        </w:rPr>
+      </w:pPr>
+      <w:r>
+        <w:rPr>
+          <w:iCs/>
+          <w:sz w:val="26"/>
+          <w:szCs w:val="26"/>
+        </w:rPr>
+        <w:t>Titre de la communication : Surcharge pondérale et l’obésité chez les enfants d’âge scolaire fréquentant des écoles primaires dans la ville de Porto Novo</w:t>
+      </w:r>
+    </w:p>
+    <w:p>
+      <w:pPr>
+        <w:spacing w:line="240" w:lineRule="auto"/>
+        <w:ind w:firstLine="0"/>
+        <w:jc w:val="left"/>
+        <w:rPr>
+          <w:b/>
+          <w:bCs/>
+          <w:i/>
+          <w:iCs/>
+          <w:sz w:val="26"/>
+          <w:szCs w:val="26"/>
+        </w:rPr>
+      </w:pPr>
+      <w:r>
+        <w:rPr>
+          <w:i/>
+          <w:sz w:val="26"/>
+          <w:szCs w:val="26"/>
+        </w:rPr>
+        <w:t xml:space="preserve">In : </w:t>
+      </w:r>
+      <w:sdt>
+        <w:sdtPr>
+          <w:rPr>
+            <w:i/>
+            <w:sz w:val="26"/>
+            <w:szCs w:val="26"/>
+          </w:rPr>
+          <w:id w:val="2041938789"/>
+          <w:placeholder>
+            <w:docPart w:val="6E58297A3137714D9B935301E935CC5D"/>
+          </w:placeholder>
+        </w:sdtPr>
+        <w:sdtContent>
+          <w:r>
+            <w:rPr>
+              <w:iCs/>
+              <w:sz w:val="26"/>
+              <w:szCs w:val="26"/>
+            </w:rPr>
+            <w:t xml:space="preserve">AZANDJEME Colette </w:t>
+          </w:r>
+          <w:proofErr w:type="gramStart"/>
+          <w:r>
+            <w:rPr>
+              <w:iCs/>
+              <w:sz w:val="26"/>
+              <w:szCs w:val="26"/>
+            </w:rPr>
+            <w:t xml:space="preserve">Sylvie </w:t>
+          </w:r>
+          <w:r>
+            <w:rPr>
+              <w:iCs/>
+              <w:sz w:val="26"/>
+              <w:szCs w:val="26"/>
+            </w:rPr>
+            <w:t xml:space="preserve"> </w:t>
+          </w:r>
+          <w:r>
+            <w:rPr>
+              <w:i/>
+              <w:sz w:val="26"/>
+              <w:szCs w:val="26"/>
+            </w:rPr>
+            <w:t>(</w:t>
+          </w:r>
+          <w:proofErr w:type="gramEnd"/>
+          <w:r>
+            <w:rPr>
+              <w:i/>
+              <w:sz w:val="26"/>
+              <w:szCs w:val="26"/>
+            </w:rPr>
+            <w:t>4eme</w:t>
+          </w:r>
+          <w:r>
+            <w:rPr>
+              <w:i/>
+              <w:sz w:val="26"/>
+              <w:szCs w:val="26"/>
+            </w:rPr>
+            <w:t xml:space="preserve">, </w:t>
+          </w:r>
+          <w:r>
+            <w:rPr>
+              <w:i/>
+              <w:sz w:val="26"/>
+              <w:szCs w:val="26"/>
+            </w:rPr>
+            <w:t xml:space="preserve">Institut Régionale de Santé Publique </w:t>
+          </w:r>
+          <w:proofErr w:type="spellStart"/>
+          <w:r>
+            <w:rPr>
+              <w:i/>
+              <w:sz w:val="26"/>
+              <w:szCs w:val="26"/>
+            </w:rPr>
+            <w:t>Comlan</w:t>
+          </w:r>
+          <w:proofErr w:type="spellEnd"/>
+          <w:r>
+            <w:rPr>
+              <w:i/>
+              <w:sz w:val="26"/>
+              <w:szCs w:val="26"/>
+            </w:rPr>
+            <w:t xml:space="preserve"> Alfred </w:t>
+          </w:r>
+          <w:proofErr w:type="spellStart"/>
+          <w:r>
+            <w:rPr>
+              <w:i/>
+              <w:sz w:val="26"/>
+              <w:szCs w:val="26"/>
+            </w:rPr>
+            <w:t>Quenum</w:t>
+          </w:r>
+          <w:proofErr w:type="spellEnd"/>
+          <w:r>
+            <w:rPr>
+              <w:i/>
+              <w:sz w:val="26"/>
+              <w:szCs w:val="26"/>
+            </w:rPr>
+            <w:t xml:space="preserve"> </w:t>
+          </w:r>
+          <w:r>
+            <w:rPr>
+              <w:i/>
+              <w:sz w:val="26"/>
+              <w:szCs w:val="26"/>
+            </w:rPr>
+            <w:t xml:space="preserve">, </w:t>
+          </w:r>
+          <w:r>
+            <w:rPr>
+              <w:i/>
+              <w:sz w:val="26"/>
+              <w:szCs w:val="26"/>
+            </w:rPr>
+            <w:t>3 au 4 décembre 2020</w:t>
+          </w:r>
+          <w:r>
+            <w:rPr>
+              <w:i/>
+              <w:sz w:val="26"/>
+              <w:szCs w:val="26"/>
+            </w:rPr>
+            <w:t>)</w:t>
+          </w:r>
+        </w:sdtContent>
+      </w:sdt>
+      <w:r>
+        <w:rPr>
+          <w:i/>
+        </w:rPr>
+        <w:t>Livre des résumés, 1ères Journées d’épidémiologie et de santé publique de l’Université de Parakou (JESP-UP, Parakou, Bénin, 6–7 mai 2022), code COD48, p. 82–83.</w:t>
+      </w:r>
+    </w:p>
+    <w:p>
+      <w:pPr>
+        <w:suppressAutoHyphens/>
+        <w:spacing w:line="240" w:lineRule="auto"/>
+        <w:ind w:right="146" w:firstLine="0"/>
+        <w:rPr>
+          <w:b/>
+          <w:color w:val="000000"/>
+          <w:spacing w:val="-1"/>
+          <w:sz w:val="26"/>
+          <w:szCs w:val="26"/>
+          <w:u w:val="single"/>
+        </w:rPr>
+      </w:pPr>
+      <w:r/>
+    </w:p>
+    <w:p>
+      <w:pPr>
+        <w:spacing w:line="240" w:lineRule="auto"/>
+        <w:ind w:firstLine="0"/>
+        <w:jc w:val="left"/>
+        <w:rPr>
+          <w:iCs/>
+          <w:sz w:val="26"/>
+          <w:szCs w:val="26"/>
+        </w:rPr>
+      </w:pPr>
+      <w:r>
+        <w:rPr>
+          <w:sz w:val="26"/>
+        </w:rPr>
+        <w:t>Auteur : AZANDJEME Colette Sylvie</w:t>
+      </w:r>
+    </w:p>
+    <w:p>
+      <w:pPr>
+        <w:spacing w:line="240" w:lineRule="auto"/>
+        <w:ind w:firstLine="0"/>
+        <w:jc w:val="left"/>
+        <w:rPr>
+          <w:iCs/>
+          <w:sz w:val="26"/>
+          <w:szCs w:val="26"/>
+        </w:rPr>
+      </w:pPr>
+      <w:r>
+        <w:rPr>
+          <w:sz w:val="26"/>
+        </w:rPr>
+        <w:t>Titre de la communication : Dénutrition chez les patients en postopératoire de chirurgie digestive au CNHU-HKM et au CHUD-OP en 2022</w:t>
+      </w:r>
+    </w:p>
+    <w:p>
+      <w:pPr>
+        <w:spacing w:line="240" w:lineRule="auto"/>
+        <w:ind w:firstLine="0"/>
+        <w:jc w:val="left"/>
+        <w:rPr>
+          <w:b/>
+          <w:bCs/>
+          <w:i/>
+          <w:iCs/>
+          <w:sz w:val="26"/>
+          <w:szCs w:val="26"/>
+        </w:rPr>
+      </w:pPr>
+      <w:r>
+        <w:rPr>
+          <w:i/>
+          <w:sz w:val="26"/>
+        </w:rPr>
+        <w:t>In : 5èmes Journées Scientifiques de l’Institut Régional de Santé Publique Comlan Alfred QUENUM (Ouidah (Bénin), 1er et 2 décembre 2022)</w:t>
+      </w:r>
+      <w:r>
+        <w:rPr>
+          <w:i/>
+          <w:highlight w:val="yellow"/>
+        </w:rPr>
+        <w:t xml:space="preserve"> [Pagination à vérifier dans le livret correspondant (ID de l’attestation : 9472070108).]</w:t>
+      </w:r>
+    </w:p>
+    <w:p>
+      <w:pPr>
+        <w:suppressAutoHyphens/>
+        <w:spacing w:line="240" w:lineRule="auto"/>
+        <w:ind w:right="146" w:firstLine="0"/>
+        <w:rPr>
+          <w:b/>
+          <w:color w:val="000000"/>
+          <w:spacing w:val="-1"/>
+          <w:sz w:val="26"/>
+          <w:szCs w:val="26"/>
+          <w:u w:val="single"/>
+        </w:rPr>
+      </w:pPr>
+    </w:p>
+    <w:p>
+      <w:pPr>
+        <w:spacing w:line="240" w:lineRule="auto"/>
+        <w:ind w:firstLine="0"/>
+        <w:jc w:val="left"/>
+        <w:rPr>
+          <w:iCs/>
+          <w:sz w:val="26"/>
+          <w:szCs w:val="26"/>
+        </w:rPr>
+      </w:pPr>
+      <w:r>
+        <w:rPr>
+          <w:sz w:val="26"/>
+        </w:rPr>
+        <w:t>Auteur : AZANDJEME Colette Sylvie</w:t>
+      </w:r>
+    </w:p>
+    <w:p>
+      <w:pPr>
+        <w:spacing w:line="240" w:lineRule="auto"/>
+        <w:ind w:firstLine="0"/>
+        <w:jc w:val="left"/>
+        <w:rPr>
+          <w:iCs/>
+          <w:sz w:val="26"/>
+          <w:szCs w:val="26"/>
+        </w:rPr>
+      </w:pPr>
+      <w:r>
+        <w:rPr>
+          <w:sz w:val="26"/>
+        </w:rPr>
+        <w:t>Titre de la communication : Profil nutritionnel des patients atteints d’hépatopathie chronique au CNHU-HKM de Cotonou</w:t>
+      </w:r>
+    </w:p>
+    <w:p>
+      <w:pPr>
+        <w:spacing w:line="240" w:lineRule="auto"/>
+        <w:ind w:firstLine="0"/>
+        <w:jc w:val="left"/>
+        <w:rPr>
+          <w:b/>
+          <w:bCs/>
+          <w:i/>
+          <w:iCs/>
+          <w:sz w:val="26"/>
+          <w:szCs w:val="26"/>
+        </w:rPr>
+      </w:pPr>
+      <w:r>
+        <w:rPr>
+          <w:i/>
+          <w:sz w:val="26"/>
+        </w:rPr>
+        <w:t>In : 5èmes Journées Scientifiques de l’Institut Régional de Santé Publique Comlan Alfred QUENUM (Ouidah (Bénin), 1er et 2 décembre 2022)</w:t>
+      </w:r>
+      <w:r>
+        <w:rPr>
+          <w:i/>
+          <w:highlight w:val="yellow"/>
+        </w:rPr>
+        <w:t xml:space="preserve"> [Pagination à vérifier dans le livret correspondant (ID de l’attestation : 5422144359).]</w:t>
+      </w:r>
+    </w:p>
+    <w:p>
+      <w:pPr>
+        <w:suppressAutoHyphens/>
+        <w:spacing w:line="240" w:lineRule="auto"/>
+        <w:ind w:right="146" w:firstLine="0"/>
+        <w:rPr>
+          <w:b/>
+          <w:color w:val="000000"/>
+          <w:spacing w:val="-1"/>
+          <w:sz w:val="26"/>
+          <w:szCs w:val="26"/>
+          <w:u w:val="single"/>
+        </w:rPr>
+      </w:pPr>
+    </w:p>
+    <w:p>
+      <w:pPr>
+        <w:spacing w:line="240" w:lineRule="auto"/>
+        <w:ind w:firstLine="0"/>
+        <w:jc w:val="left"/>
+        <w:rPr>
+          <w:iCs/>
+          <w:sz w:val="26"/>
+          <w:szCs w:val="26"/>
+        </w:rPr>
+      </w:pPr>
+      <w:r>
+        <w:rPr>
+          <w:sz w:val="26"/>
+        </w:rPr>
+        <w:t>Auteur : AZANDJEME Colette Sylvie</w:t>
+      </w:r>
+    </w:p>
+    <w:p>
+      <w:pPr>
+        <w:spacing w:line="240" w:lineRule="auto"/>
+        <w:ind w:firstLine="0"/>
+        <w:jc w:val="left"/>
+        <w:rPr>
+          <w:iCs/>
+          <w:sz w:val="26"/>
+          <w:szCs w:val="26"/>
+        </w:rPr>
+      </w:pPr>
+      <w:r>
+        <w:rPr>
+          <w:sz w:val="26"/>
+        </w:rPr>
+        <w:t>Titre de la communication : Habitudes de consommation des alicaments et facteurs associés dans la ville de Cotonou au Bénin</w:t>
+      </w:r>
+    </w:p>
+    <w:p>
+      <w:pPr>
+        <w:spacing w:line="240" w:lineRule="auto"/>
+        <w:ind w:firstLine="0"/>
+        <w:jc w:val="left"/>
+        <w:rPr>
+          <w:b/>
+          <w:bCs/>
+          <w:i/>
+          <w:iCs/>
+          <w:sz w:val="26"/>
+          <w:szCs w:val="26"/>
+        </w:rPr>
+      </w:pPr>
+      <w:r>
+        <w:rPr>
+          <w:i/>
+          <w:sz w:val="26"/>
+        </w:rPr>
+        <w:t>In : 5èmes Journées Scientifiques de l’Institut Régional de Santé Publique Comlan Alfred QUENUM (Ouidah (Bénin), 1er et 2 décembre 2022)</w:t>
+      </w:r>
+      <w:r>
+        <w:rPr>
+          <w:i/>
+          <w:highlight w:val="yellow"/>
+        </w:rPr>
+        <w:t xml:space="preserve"> [Pagination à vérifier dans le livret correspondant (ID de l’attestation : 3609151358).]</w:t>
+      </w:r>
+    </w:p>
+    <w:p>
+      <w:pPr>
+        <w:suppressAutoHyphens/>
+        <w:spacing w:line="240" w:lineRule="auto"/>
+        <w:ind w:right="146" w:firstLine="0"/>
+        <w:rPr>
+          <w:b/>
+          <w:color w:val="000000"/>
+          <w:spacing w:val="-1"/>
+          <w:sz w:val="26"/>
+          <w:szCs w:val="26"/>
+          <w:u w:val="single"/>
+        </w:rPr>
+      </w:pPr>
+    </w:p>
+    <w:p>
+      <w:pPr>
+        <w:spacing w:line="240" w:lineRule="auto"/>
+        <w:ind w:firstLine="0"/>
+        <w:jc w:val="left"/>
+        <w:rPr>
+          <w:iCs/>
+          <w:sz w:val="26"/>
+          <w:szCs w:val="26"/>
+        </w:rPr>
+      </w:pPr>
+      <w:r>
+        <w:rPr>
+          <w:sz w:val="26"/>
+        </w:rPr>
+        <w:t>Auteur : AZANDJEME Colette Sylvie</w:t>
+      </w:r>
+    </w:p>
+    <w:p>
+      <w:pPr>
+        <w:spacing w:line="240" w:lineRule="auto"/>
+        <w:ind w:firstLine="0"/>
+        <w:jc w:val="left"/>
+        <w:rPr>
+          <w:iCs/>
+          <w:sz w:val="26"/>
+          <w:szCs w:val="26"/>
+        </w:rPr>
+      </w:pPr>
+      <w:r>
+        <w:rPr>
+          <w:sz w:val="26"/>
+        </w:rPr>
+        <w:t>Titre de la communication : Évaluation de la qualité des soins nutritionnels chez l’enfant hospitalisé au CHU-MEL en 2022</w:t>
+      </w:r>
+    </w:p>
+    <w:p>
+      <w:pPr>
+        <w:spacing w:line="240" w:lineRule="auto"/>
+        <w:ind w:firstLine="0"/>
+        <w:jc w:val="left"/>
+        <w:rPr>
+          <w:b/>
+          <w:bCs/>
+          <w:i/>
+          <w:iCs/>
+          <w:sz w:val="26"/>
+          <w:szCs w:val="26"/>
+        </w:rPr>
+      </w:pPr>
+      <w:r>
+        <w:rPr>
+          <w:i/>
+          <w:sz w:val="26"/>
+        </w:rPr>
+        <w:t>In : 5èmes Journées Scientifiques de l’Institut Régional de Santé Publique Comlan Alfred QUENUM (Ouidah (Bénin), 1er et 2 décembre 2022)</w:t>
+      </w:r>
+      <w:r>
+        <w:rPr>
+          <w:i/>
+          <w:highlight w:val="yellow"/>
+        </w:rPr>
+        <w:t xml:space="preserve"> [Pagination à vérifier dans le livret correspondant (ID de l’attestation : 8968688003).]</w:t>
+      </w:r>
+    </w:p>
+    <w:p>
+      <w:pPr>
+        <w:suppressAutoHyphens/>
+        <w:spacing w:line="240" w:lineRule="auto"/>
+        <w:ind w:right="146" w:firstLine="0"/>
+        <w:rPr>
+          <w:b/>
+          <w:color w:val="000000"/>
+          <w:spacing w:val="-1"/>
+          <w:sz w:val="26"/>
+          <w:szCs w:val="26"/>
+          <w:u w:val="single"/>
+        </w:rPr>
+      </w:pPr>
     </w:p>
     <w:p>
       <w:pPr>
@@ -2946,6 +4611,1630 @@
         </w:rPr>
         <w:t>Année : 2025</w:t>
       </w:r>
+    </w:p>
+    <w:p>
+      <w:pPr>
+        <w:spacing w:line="240" w:lineRule="auto"/>
+        <w:ind w:firstLine="0"/>
+        <w:jc w:val="left"/>
+        <w:rPr>
+          <w:iCs/>
+          <w:sz w:val="26"/>
+          <w:szCs w:val="26"/>
+        </w:rPr>
+      </w:pPr>
+      <w:r>
+        <w:rPr>
+          <w:iCs/>
+          <w:sz w:val="26"/>
+          <w:szCs w:val="26"/>
+        </w:rPr>
+        <w:t>Auteurs : Houssou Gbèmahon Roger, Azandjeme Colette Sylvie, Akpo-djenontin Opportune, Fanou Nadia, Metonnou Clémence Germaine, Sossa Charles Jérôme, Compaore Ella, Mongbo Roch</w:t>
+      </w:r>
+      <w:r>
+        <w:rPr>
+          <w:iCs/>
+          <w:sz w:val="26"/>
+          <w:szCs w:val="26"/>
+        </w:rPr>
+      </w:r>
+      <w:r>
+        <w:rPr>
+          <w:iCs/>
+          <w:sz w:val="26"/>
+          <w:szCs w:val="26"/>
+        </w:rPr>
+      </w:r>
+    </w:p>
+    <w:p>
+      <w:pPr>
+        <w:spacing w:line="240" w:lineRule="auto"/>
+        <w:ind w:firstLine="0"/>
+        <w:jc w:val="left"/>
+        <w:rPr>
+          <w:iCs/>
+          <w:sz w:val="26"/>
+          <w:szCs w:val="26"/>
+        </w:rPr>
+      </w:pPr>
+      <w:r>
+        <w:rPr>
+          <w:iCs/>
+          <w:sz w:val="26"/>
+          <w:szCs w:val="26"/>
+        </w:rPr>
+        <w:t>Titre de la communication : Effets d’une intervention de soutien alimentaire aux gestantes pour la prévention du faible poids à la naissance</w:t>
+      </w:r>
+    </w:p>
+    <w:p>
+      <w:pPr>
+        <w:spacing w:line="240" w:lineRule="auto"/>
+        <w:ind w:firstLine="0"/>
+        <w:jc w:val="left"/>
+        <w:rPr>
+          <w:b/>
+          <w:bCs/>
+          <w:i/>
+          <w:iCs/>
+          <w:sz w:val="26"/>
+          <w:szCs w:val="26"/>
+        </w:rPr>
+      </w:pPr>
+      <w:r>
+        <w:rPr>
+          <w:i/>
+          <w:sz w:val="26"/>
+          <w:szCs w:val="26"/>
+        </w:rPr>
+        <w:t xml:space="preserve">In : </w:t>
+      </w:r>
+      <w:sdt>
+        <w:sdtPr>
+          <w:rPr>
+            <w:i/>
+            <w:sz w:val="26"/>
+            <w:szCs w:val="26"/>
+          </w:rPr>
+          <w:id w:val="2041938789"/>
+          <w:placeholder>
+            <w:docPart w:val="6E58297A3137714D9B935301E935CC5D"/>
+          </w:placeholder>
+        </w:sdtPr>
+        <w:sdtContent>
+          <w:r>
+            <w:rPr>
+              <w:iCs/>
+              <w:sz w:val="26"/>
+              <w:szCs w:val="26"/>
+            </w:rPr>
+            <w:t xml:space="preserve">AZANDJEME Colette </w:t>
+          </w:r>
+          <w:proofErr w:type="gramStart"/>
+          <w:r>
+            <w:rPr>
+              <w:iCs/>
+              <w:sz w:val="26"/>
+              <w:szCs w:val="26"/>
+            </w:rPr>
+            <w:t xml:space="preserve">Sylvie </w:t>
+          </w:r>
+          <w:r>
+            <w:rPr>
+              <w:iCs/>
+              <w:sz w:val="26"/>
+              <w:szCs w:val="26"/>
+            </w:rPr>
+            <w:t xml:space="preserve"> </w:t>
+          </w:r>
+          <w:r>
+            <w:rPr>
+              <w:i/>
+              <w:sz w:val="26"/>
+              <w:szCs w:val="26"/>
+            </w:rPr>
+            <w:t>(</w:t>
+          </w:r>
+          <w:proofErr w:type="gramEnd"/>
+          <w:r>
+            <w:rPr>
+              <w:i/>
+              <w:sz w:val="26"/>
+              <w:szCs w:val="26"/>
+            </w:rPr>
+            <w:t>4eme</w:t>
+          </w:r>
+          <w:r>
+            <w:rPr>
+              <w:i/>
+              <w:sz w:val="26"/>
+              <w:szCs w:val="26"/>
+            </w:rPr>
+            <w:t xml:space="preserve">, </w:t>
+          </w:r>
+          <w:r>
+            <w:rPr>
+              <w:i/>
+              <w:sz w:val="26"/>
+              <w:szCs w:val="26"/>
+            </w:rPr>
+            <w:t xml:space="preserve">Institut Régionale de Santé Publique </w:t>
+          </w:r>
+          <w:proofErr w:type="spellStart"/>
+          <w:r>
+            <w:rPr>
+              <w:i/>
+              <w:sz w:val="26"/>
+              <w:szCs w:val="26"/>
+            </w:rPr>
+            <w:t>Comlan</w:t>
+          </w:r>
+          <w:proofErr w:type="spellEnd"/>
+          <w:r>
+            <w:rPr>
+              <w:i/>
+              <w:sz w:val="26"/>
+              <w:szCs w:val="26"/>
+            </w:rPr>
+            <w:t xml:space="preserve"> Alfred </w:t>
+          </w:r>
+          <w:proofErr w:type="spellStart"/>
+          <w:r>
+            <w:rPr>
+              <w:i/>
+              <w:sz w:val="26"/>
+              <w:szCs w:val="26"/>
+            </w:rPr>
+            <w:t>Quenum</w:t>
+          </w:r>
+          <w:proofErr w:type="spellEnd"/>
+          <w:r>
+            <w:rPr>
+              <w:i/>
+              <w:sz w:val="26"/>
+              <w:szCs w:val="26"/>
+            </w:rPr>
+            <w:t xml:space="preserve"> </w:t>
+          </w:r>
+          <w:r>
+            <w:rPr>
+              <w:i/>
+              <w:sz w:val="26"/>
+              <w:szCs w:val="26"/>
+            </w:rPr>
+            <w:t xml:space="preserve">, </w:t>
+          </w:r>
+          <w:r>
+            <w:rPr>
+              <w:i/>
+              <w:sz w:val="26"/>
+              <w:szCs w:val="26"/>
+            </w:rPr>
+            <w:t>3 au 4 décembre 2020</w:t>
+          </w:r>
+          <w:r>
+            <w:rPr>
+              <w:i/>
+              <w:sz w:val="26"/>
+              <w:szCs w:val="26"/>
+            </w:rPr>
+            <w:t>)</w:t>
+          </w:r>
+        </w:sdtContent>
+      </w:sdt>
+      <w:r>
+        <w:rPr>
+          <w:i/>
+        </w:rPr>
+        <w:t>Programme scientifique et résumés des communications, 6èmes Journées Scientifiques de l’IRSP-CAQ (Ouidah, Bénin, 22–26 avril 2025), code COSC12, p. 68.</w:t>
+      </w:r>
+    </w:p>
+    <w:p>
+      <w:pPr>
+        <w:suppressAutoHyphens/>
+        <w:spacing w:line="240" w:lineRule="auto"/>
+        <w:ind w:right="146" w:firstLine="0"/>
+        <w:rPr>
+          <w:b/>
+          <w:color w:val="000000"/>
+          <w:spacing w:val="-1"/>
+          <w:sz w:val="26"/>
+          <w:szCs w:val="26"/>
+          <w:u w:val="single"/>
+        </w:rPr>
+      </w:pPr>
+      <w:r/>
+    </w:p>
+    <w:p>
+      <w:pPr>
+        <w:spacing w:line="240" w:lineRule="auto"/>
+        <w:ind w:firstLine="0"/>
+        <w:jc w:val="left"/>
+        <w:rPr>
+          <w:iCs/>
+          <w:sz w:val="26"/>
+          <w:szCs w:val="26"/>
+        </w:rPr>
+      </w:pPr>
+      <w:r>
+        <w:rPr>
+          <w:iCs/>
+          <w:sz w:val="26"/>
+          <w:szCs w:val="26"/>
+        </w:rPr>
+        <w:t>Auteurs : Metonnou Clémence Germaine, Azandjèmè Colette Sylvie, Soussia Théodore, Affo Hilary, Sossa Charles, Agueh Victoire</w:t>
+      </w:r>
+      <w:r>
+        <w:rPr>
+          <w:iCs/>
+          <w:sz w:val="26"/>
+          <w:szCs w:val="26"/>
+        </w:rPr>
+      </w:r>
+      <w:r>
+        <w:rPr>
+          <w:iCs/>
+          <w:sz w:val="26"/>
+          <w:szCs w:val="26"/>
+        </w:rPr>
+      </w:r>
+    </w:p>
+    <w:p>
+      <w:pPr>
+        <w:spacing w:line="240" w:lineRule="auto"/>
+        <w:ind w:firstLine="0"/>
+        <w:jc w:val="left"/>
+        <w:rPr>
+          <w:iCs/>
+          <w:sz w:val="26"/>
+          <w:szCs w:val="26"/>
+        </w:rPr>
+      </w:pPr>
+      <w:r>
+        <w:rPr>
+          <w:iCs/>
+          <w:sz w:val="26"/>
+          <w:szCs w:val="26"/>
+        </w:rPr>
+        <w:t>Titre de la communication : Evaluation de la prise en charge de la malnutrition aiguë sévère chez les enfants de 6 à 59 mois</w:t>
+      </w:r>
+    </w:p>
+    <w:p>
+      <w:pPr>
+        <w:spacing w:line="240" w:lineRule="auto"/>
+        <w:ind w:firstLine="0"/>
+        <w:jc w:val="left"/>
+        <w:rPr>
+          <w:b/>
+          <w:bCs/>
+          <w:i/>
+          <w:iCs/>
+          <w:sz w:val="26"/>
+          <w:szCs w:val="26"/>
+        </w:rPr>
+      </w:pPr>
+      <w:r>
+        <w:rPr>
+          <w:i/>
+          <w:sz w:val="26"/>
+          <w:szCs w:val="26"/>
+        </w:rPr>
+        <w:t xml:space="preserve">In : </w:t>
+      </w:r>
+      <w:sdt>
+        <w:sdtPr>
+          <w:rPr>
+            <w:i/>
+            <w:sz w:val="26"/>
+            <w:szCs w:val="26"/>
+          </w:rPr>
+          <w:id w:val="2041938789"/>
+          <w:placeholder>
+            <w:docPart w:val="6E58297A3137714D9B935301E935CC5D"/>
+          </w:placeholder>
+        </w:sdtPr>
+        <w:sdtContent>
+          <w:r>
+            <w:rPr>
+              <w:iCs/>
+              <w:sz w:val="26"/>
+              <w:szCs w:val="26"/>
+            </w:rPr>
+            <w:t xml:space="preserve">AZANDJEME Colette </w:t>
+          </w:r>
+          <w:proofErr w:type="gramStart"/>
+          <w:r>
+            <w:rPr>
+              <w:iCs/>
+              <w:sz w:val="26"/>
+              <w:szCs w:val="26"/>
+            </w:rPr>
+            <w:t xml:space="preserve">Sylvie </w:t>
+          </w:r>
+          <w:r>
+            <w:rPr>
+              <w:iCs/>
+              <w:sz w:val="26"/>
+              <w:szCs w:val="26"/>
+            </w:rPr>
+            <w:t xml:space="preserve"> </w:t>
+          </w:r>
+          <w:r>
+            <w:rPr>
+              <w:i/>
+              <w:sz w:val="26"/>
+              <w:szCs w:val="26"/>
+            </w:rPr>
+            <w:t>(</w:t>
+          </w:r>
+          <w:proofErr w:type="gramEnd"/>
+          <w:r>
+            <w:rPr>
+              <w:i/>
+              <w:sz w:val="26"/>
+              <w:szCs w:val="26"/>
+            </w:rPr>
+            <w:t>4eme</w:t>
+          </w:r>
+          <w:r>
+            <w:rPr>
+              <w:i/>
+              <w:sz w:val="26"/>
+              <w:szCs w:val="26"/>
+            </w:rPr>
+            <w:t xml:space="preserve">, </w:t>
+          </w:r>
+          <w:r>
+            <w:rPr>
+              <w:i/>
+              <w:sz w:val="26"/>
+              <w:szCs w:val="26"/>
+            </w:rPr>
+            <w:t xml:space="preserve">Institut Régionale de Santé Publique </w:t>
+          </w:r>
+          <w:proofErr w:type="spellStart"/>
+          <w:r>
+            <w:rPr>
+              <w:i/>
+              <w:sz w:val="26"/>
+              <w:szCs w:val="26"/>
+            </w:rPr>
+            <w:t>Comlan</w:t>
+          </w:r>
+          <w:proofErr w:type="spellEnd"/>
+          <w:r>
+            <w:rPr>
+              <w:i/>
+              <w:sz w:val="26"/>
+              <w:szCs w:val="26"/>
+            </w:rPr>
+            <w:t xml:space="preserve"> Alfred </w:t>
+          </w:r>
+          <w:proofErr w:type="spellStart"/>
+          <w:r>
+            <w:rPr>
+              <w:i/>
+              <w:sz w:val="26"/>
+              <w:szCs w:val="26"/>
+            </w:rPr>
+            <w:t>Quenum</w:t>
+          </w:r>
+          <w:proofErr w:type="spellEnd"/>
+          <w:r>
+            <w:rPr>
+              <w:i/>
+              <w:sz w:val="26"/>
+              <w:szCs w:val="26"/>
+            </w:rPr>
+            <w:t xml:space="preserve"> </w:t>
+          </w:r>
+          <w:r>
+            <w:rPr>
+              <w:i/>
+              <w:sz w:val="26"/>
+              <w:szCs w:val="26"/>
+            </w:rPr>
+            <w:t xml:space="preserve">, </w:t>
+          </w:r>
+          <w:r>
+            <w:rPr>
+              <w:i/>
+              <w:sz w:val="26"/>
+              <w:szCs w:val="26"/>
+            </w:rPr>
+            <w:t>3 au 4 décembre 2020</w:t>
+          </w:r>
+          <w:r>
+            <w:rPr>
+              <w:i/>
+              <w:sz w:val="26"/>
+              <w:szCs w:val="26"/>
+            </w:rPr>
+            <w:t>)</w:t>
+          </w:r>
+        </w:sdtContent>
+      </w:sdt>
+      <w:r>
+        <w:rPr>
+          <w:i/>
+        </w:rPr>
+        <w:t>Programme scientifique et résumés des communications, 6èmes Journées Scientifiques de l’IRSP-CAQ (Ouidah, Bénin, 22–26 avril 2025), code COSC27, p. 81.</w:t>
+      </w:r>
+    </w:p>
+    <w:p>
+      <w:pPr>
+        <w:suppressAutoHyphens/>
+        <w:spacing w:line="240" w:lineRule="auto"/>
+        <w:ind w:right="146" w:firstLine="0"/>
+        <w:rPr>
+          <w:b/>
+          <w:color w:val="000000"/>
+          <w:spacing w:val="-1"/>
+          <w:sz w:val="26"/>
+          <w:szCs w:val="26"/>
+          <w:u w:val="single"/>
+        </w:rPr>
+      </w:pPr>
+      <w:r/>
+    </w:p>
+    <w:p>
+      <w:pPr>
+        <w:spacing w:line="240" w:lineRule="auto"/>
+        <w:ind w:firstLine="0"/>
+        <w:jc w:val="left"/>
+        <w:rPr>
+          <w:iCs/>
+          <w:sz w:val="26"/>
+          <w:szCs w:val="26"/>
+        </w:rPr>
+      </w:pPr>
+      <w:r>
+        <w:rPr>
+          <w:iCs/>
+          <w:sz w:val="26"/>
+          <w:szCs w:val="26"/>
+        </w:rPr>
+        <w:t>Auteurs : Kiki Djivoh Sidonie Mahougnon, Tonon Brigitte Affidéhomé, Azandjeme Colette, Bio Nigan Issiako, Hounhouigan Djidjoho Joseph</w:t>
+      </w:r>
+      <w:r>
+        <w:rPr>
+          <w:iCs/>
+          <w:sz w:val="26"/>
+          <w:szCs w:val="26"/>
+        </w:rPr>
+      </w:r>
+      <w:r>
+        <w:rPr>
+          <w:iCs/>
+          <w:sz w:val="26"/>
+          <w:szCs w:val="26"/>
+        </w:rPr>
+      </w:r>
+    </w:p>
+    <w:p>
+      <w:pPr>
+        <w:spacing w:line="240" w:lineRule="auto"/>
+        <w:ind w:firstLine="0"/>
+        <w:jc w:val="left"/>
+        <w:rPr>
+          <w:iCs/>
+          <w:sz w:val="26"/>
+          <w:szCs w:val="26"/>
+        </w:rPr>
+      </w:pPr>
+      <w:r>
+        <w:rPr>
+          <w:iCs/>
+          <w:sz w:val="26"/>
+          <w:szCs w:val="26"/>
+        </w:rPr>
+        <w:t>Titre de la communication : Alimentation des élèves adolescents des classes sportives de la commune de Gogounou en 2023</w:t>
+      </w:r>
+    </w:p>
+    <w:p>
+      <w:pPr>
+        <w:spacing w:line="240" w:lineRule="auto"/>
+        <w:ind w:firstLine="0"/>
+        <w:jc w:val="left"/>
+        <w:rPr>
+          <w:b/>
+          <w:bCs/>
+          <w:i/>
+          <w:iCs/>
+          <w:sz w:val="26"/>
+          <w:szCs w:val="26"/>
+        </w:rPr>
+      </w:pPr>
+      <w:r>
+        <w:rPr>
+          <w:i/>
+          <w:sz w:val="26"/>
+          <w:szCs w:val="26"/>
+        </w:rPr>
+        <w:t xml:space="preserve">In : </w:t>
+      </w:r>
+      <w:sdt>
+        <w:sdtPr>
+          <w:rPr>
+            <w:i/>
+            <w:sz w:val="26"/>
+            <w:szCs w:val="26"/>
+          </w:rPr>
+          <w:id w:val="2041938789"/>
+          <w:placeholder>
+            <w:docPart w:val="6E58297A3137714D9B935301E935CC5D"/>
+          </w:placeholder>
+        </w:sdtPr>
+        <w:sdtContent>
+          <w:r>
+            <w:rPr>
+              <w:iCs/>
+              <w:sz w:val="26"/>
+              <w:szCs w:val="26"/>
+            </w:rPr>
+            <w:t xml:space="preserve">AZANDJEME Colette </w:t>
+          </w:r>
+          <w:proofErr w:type="gramStart"/>
+          <w:r>
+            <w:rPr>
+              <w:iCs/>
+              <w:sz w:val="26"/>
+              <w:szCs w:val="26"/>
+            </w:rPr>
+            <w:t xml:space="preserve">Sylvie </w:t>
+          </w:r>
+          <w:r>
+            <w:rPr>
+              <w:iCs/>
+              <w:sz w:val="26"/>
+              <w:szCs w:val="26"/>
+            </w:rPr>
+            <w:t xml:space="preserve"> </w:t>
+          </w:r>
+          <w:r>
+            <w:rPr>
+              <w:i/>
+              <w:sz w:val="26"/>
+              <w:szCs w:val="26"/>
+            </w:rPr>
+            <w:t>(</w:t>
+          </w:r>
+          <w:proofErr w:type="gramEnd"/>
+          <w:r>
+            <w:rPr>
+              <w:i/>
+              <w:sz w:val="26"/>
+              <w:szCs w:val="26"/>
+            </w:rPr>
+            <w:t>4eme</w:t>
+          </w:r>
+          <w:r>
+            <w:rPr>
+              <w:i/>
+              <w:sz w:val="26"/>
+              <w:szCs w:val="26"/>
+            </w:rPr>
+            <w:t xml:space="preserve">, </w:t>
+          </w:r>
+          <w:r>
+            <w:rPr>
+              <w:i/>
+              <w:sz w:val="26"/>
+              <w:szCs w:val="26"/>
+            </w:rPr>
+            <w:t xml:space="preserve">Institut Régionale de Santé Publique </w:t>
+          </w:r>
+          <w:proofErr w:type="spellStart"/>
+          <w:r>
+            <w:rPr>
+              <w:i/>
+              <w:sz w:val="26"/>
+              <w:szCs w:val="26"/>
+            </w:rPr>
+            <w:t>Comlan</w:t>
+          </w:r>
+          <w:proofErr w:type="spellEnd"/>
+          <w:r>
+            <w:rPr>
+              <w:i/>
+              <w:sz w:val="26"/>
+              <w:szCs w:val="26"/>
+            </w:rPr>
+            <w:t xml:space="preserve"> Alfred </w:t>
+          </w:r>
+          <w:proofErr w:type="spellStart"/>
+          <w:r>
+            <w:rPr>
+              <w:i/>
+              <w:sz w:val="26"/>
+              <w:szCs w:val="26"/>
+            </w:rPr>
+            <w:t>Quenum</w:t>
+          </w:r>
+          <w:proofErr w:type="spellEnd"/>
+          <w:r>
+            <w:rPr>
+              <w:i/>
+              <w:sz w:val="26"/>
+              <w:szCs w:val="26"/>
+            </w:rPr>
+            <w:t xml:space="preserve"> </w:t>
+          </w:r>
+          <w:r>
+            <w:rPr>
+              <w:i/>
+              <w:sz w:val="26"/>
+              <w:szCs w:val="26"/>
+            </w:rPr>
+            <w:t xml:space="preserve">, </w:t>
+          </w:r>
+          <w:r>
+            <w:rPr>
+              <w:i/>
+              <w:sz w:val="26"/>
+              <w:szCs w:val="26"/>
+            </w:rPr>
+            <w:t>3 au 4 décembre 2020</w:t>
+          </w:r>
+          <w:r>
+            <w:rPr>
+              <w:i/>
+              <w:sz w:val="26"/>
+              <w:szCs w:val="26"/>
+            </w:rPr>
+            <w:t>)</w:t>
+          </w:r>
+        </w:sdtContent>
+      </w:sdt>
+      <w:r>
+        <w:rPr>
+          <w:i/>
+        </w:rPr>
+        <w:t>Programme scientifique et résumés des communications, 6èmes Journées Scientifiques de l’IRSP-CAQ (Ouidah, Bénin, 22–26 avril 2025), code COSC28, p. 82.</w:t>
+      </w:r>
+    </w:p>
+    <w:p>
+      <w:pPr>
+        <w:suppressAutoHyphens/>
+        <w:spacing w:line="240" w:lineRule="auto"/>
+        <w:ind w:right="146" w:firstLine="0"/>
+        <w:rPr>
+          <w:b/>
+          <w:color w:val="000000"/>
+          <w:spacing w:val="-1"/>
+          <w:sz w:val="26"/>
+          <w:szCs w:val="26"/>
+          <w:u w:val="single"/>
+        </w:rPr>
+      </w:pPr>
+      <w:r/>
+    </w:p>
+    <w:p>
+      <w:pPr>
+        <w:spacing w:line="240" w:lineRule="auto"/>
+        <w:ind w:firstLine="0"/>
+        <w:jc w:val="left"/>
+        <w:rPr>
+          <w:iCs/>
+          <w:sz w:val="26"/>
+          <w:szCs w:val="26"/>
+        </w:rPr>
+      </w:pPr>
+      <w:r>
+        <w:rPr>
+          <w:iCs/>
+          <w:sz w:val="26"/>
+          <w:szCs w:val="26"/>
+        </w:rPr>
+        <w:t>Auteurs : Mongbo Virginie, Natonnagnon Géraud, Tokoudagba Jean-Marie, Azandjeme Colette, Charles Sossa-Jerome</w:t>
+      </w:r>
+      <w:r>
+        <w:rPr>
+          <w:iCs/>
+          <w:sz w:val="26"/>
+          <w:szCs w:val="26"/>
+        </w:rPr>
+      </w:r>
+      <w:r>
+        <w:rPr>
+          <w:iCs/>
+          <w:sz w:val="26"/>
+          <w:szCs w:val="26"/>
+        </w:rPr>
+      </w:r>
+    </w:p>
+    <w:p>
+      <w:pPr>
+        <w:spacing w:line="240" w:lineRule="auto"/>
+        <w:ind w:firstLine="0"/>
+        <w:jc w:val="left"/>
+        <w:rPr>
+          <w:iCs/>
+          <w:sz w:val="26"/>
+          <w:szCs w:val="26"/>
+        </w:rPr>
+      </w:pPr>
+      <w:r>
+        <w:rPr>
+          <w:iCs/>
+          <w:sz w:val="26"/>
+          <w:szCs w:val="26"/>
+        </w:rPr>
+        <w:t>Titre de la communication : Dispensation des médicaments et erreurs médicamenteuses dans les officines de pharmacie privées à Cotonou</w:t>
+      </w:r>
+    </w:p>
+    <w:p>
+      <w:pPr>
+        <w:spacing w:line="240" w:lineRule="auto"/>
+        <w:ind w:firstLine="0"/>
+        <w:jc w:val="left"/>
+        <w:rPr>
+          <w:b/>
+          <w:bCs/>
+          <w:i/>
+          <w:iCs/>
+          <w:sz w:val="26"/>
+          <w:szCs w:val="26"/>
+        </w:rPr>
+      </w:pPr>
+      <w:r>
+        <w:rPr>
+          <w:i/>
+          <w:sz w:val="26"/>
+          <w:szCs w:val="26"/>
+        </w:rPr>
+        <w:t xml:space="preserve">In : </w:t>
+      </w:r>
+      <w:sdt>
+        <w:sdtPr>
+          <w:rPr>
+            <w:i/>
+            <w:sz w:val="26"/>
+            <w:szCs w:val="26"/>
+          </w:rPr>
+          <w:id w:val="2041938789"/>
+          <w:placeholder>
+            <w:docPart w:val="6E58297A3137714D9B935301E935CC5D"/>
+          </w:placeholder>
+        </w:sdtPr>
+        <w:sdtContent>
+          <w:r>
+            <w:rPr>
+              <w:iCs/>
+              <w:sz w:val="26"/>
+              <w:szCs w:val="26"/>
+            </w:rPr>
+            <w:t xml:space="preserve">AZANDJEME Colette </w:t>
+          </w:r>
+          <w:proofErr w:type="gramStart"/>
+          <w:r>
+            <w:rPr>
+              <w:iCs/>
+              <w:sz w:val="26"/>
+              <w:szCs w:val="26"/>
+            </w:rPr>
+            <w:t xml:space="preserve">Sylvie </w:t>
+          </w:r>
+          <w:r>
+            <w:rPr>
+              <w:iCs/>
+              <w:sz w:val="26"/>
+              <w:szCs w:val="26"/>
+            </w:rPr>
+            <w:t xml:space="preserve"> </w:t>
+          </w:r>
+          <w:r>
+            <w:rPr>
+              <w:i/>
+              <w:sz w:val="26"/>
+              <w:szCs w:val="26"/>
+            </w:rPr>
+            <w:t>(</w:t>
+          </w:r>
+          <w:proofErr w:type="gramEnd"/>
+          <w:r>
+            <w:rPr>
+              <w:i/>
+              <w:sz w:val="26"/>
+              <w:szCs w:val="26"/>
+            </w:rPr>
+            <w:t>4eme</w:t>
+          </w:r>
+          <w:r>
+            <w:rPr>
+              <w:i/>
+              <w:sz w:val="26"/>
+              <w:szCs w:val="26"/>
+            </w:rPr>
+            <w:t xml:space="preserve">, </w:t>
+          </w:r>
+          <w:r>
+            <w:rPr>
+              <w:i/>
+              <w:sz w:val="26"/>
+              <w:szCs w:val="26"/>
+            </w:rPr>
+            <w:t xml:space="preserve">Institut Régionale de Santé Publique </w:t>
+          </w:r>
+          <w:proofErr w:type="spellStart"/>
+          <w:r>
+            <w:rPr>
+              <w:i/>
+              <w:sz w:val="26"/>
+              <w:szCs w:val="26"/>
+            </w:rPr>
+            <w:t>Comlan</w:t>
+          </w:r>
+          <w:proofErr w:type="spellEnd"/>
+          <w:r>
+            <w:rPr>
+              <w:i/>
+              <w:sz w:val="26"/>
+              <w:szCs w:val="26"/>
+            </w:rPr>
+            <w:t xml:space="preserve"> Alfred </w:t>
+          </w:r>
+          <w:proofErr w:type="spellStart"/>
+          <w:r>
+            <w:rPr>
+              <w:i/>
+              <w:sz w:val="26"/>
+              <w:szCs w:val="26"/>
+            </w:rPr>
+            <w:t>Quenum</w:t>
+          </w:r>
+          <w:proofErr w:type="spellEnd"/>
+          <w:r>
+            <w:rPr>
+              <w:i/>
+              <w:sz w:val="26"/>
+              <w:szCs w:val="26"/>
+            </w:rPr>
+            <w:t xml:space="preserve"> </w:t>
+          </w:r>
+          <w:r>
+            <w:rPr>
+              <w:i/>
+              <w:sz w:val="26"/>
+              <w:szCs w:val="26"/>
+            </w:rPr>
+            <w:t xml:space="preserve">, </w:t>
+          </w:r>
+          <w:r>
+            <w:rPr>
+              <w:i/>
+              <w:sz w:val="26"/>
+              <w:szCs w:val="26"/>
+            </w:rPr>
+            <w:t>3 au 4 décembre 2020</w:t>
+          </w:r>
+          <w:r>
+            <w:rPr>
+              <w:i/>
+              <w:sz w:val="26"/>
+              <w:szCs w:val="26"/>
+            </w:rPr>
+            <w:t>)</w:t>
+          </w:r>
+        </w:sdtContent>
+      </w:sdt>
+      <w:r>
+        <w:rPr>
+          <w:i/>
+        </w:rPr>
+        <w:t>Programme scientifique et résumés des communications, 6èmes Journées Scientifiques de l’IRSP-CAQ (Ouidah, Bénin, 22–26 avril 2025), code COCL26, p. 145.</w:t>
+      </w:r>
+    </w:p>
+    <w:p>
+      <w:pPr>
+        <w:suppressAutoHyphens/>
+        <w:spacing w:line="240" w:lineRule="auto"/>
+        <w:ind w:right="146" w:firstLine="0"/>
+        <w:rPr>
+          <w:b/>
+          <w:color w:val="000000"/>
+          <w:spacing w:val="-1"/>
+          <w:sz w:val="26"/>
+          <w:szCs w:val="26"/>
+          <w:u w:val="single"/>
+        </w:rPr>
+      </w:pPr>
+      <w:r/>
+    </w:p>
+    <w:p>
+      <w:pPr>
+        <w:spacing w:line="240" w:lineRule="auto"/>
+        <w:ind w:firstLine="0"/>
+        <w:jc w:val="left"/>
+        <w:rPr>
+          <w:iCs/>
+          <w:sz w:val="26"/>
+          <w:szCs w:val="26"/>
+        </w:rPr>
+      </w:pPr>
+      <w:r>
+        <w:rPr>
+          <w:iCs/>
+          <w:sz w:val="26"/>
+          <w:szCs w:val="26"/>
+        </w:rPr>
+        <w:t>Auteurs : Azandjeme Colette Sylvie, Medenou Christelle Nina, Mizehoun Carmelle Gbèdécon, Houssou Gbemahon Roger, Metonnou Clemence, Sossa Charles</w:t>
+      </w:r>
+      <w:r>
+        <w:rPr>
+          <w:iCs/>
+          <w:sz w:val="26"/>
+          <w:szCs w:val="26"/>
+        </w:rPr>
+      </w:r>
+      <w:r>
+        <w:rPr>
+          <w:iCs/>
+          <w:sz w:val="26"/>
+          <w:szCs w:val="26"/>
+        </w:rPr>
+      </w:r>
+    </w:p>
+    <w:p>
+      <w:pPr>
+        <w:spacing w:line="240" w:lineRule="auto"/>
+        <w:ind w:firstLine="0"/>
+        <w:jc w:val="left"/>
+        <w:rPr>
+          <w:iCs/>
+          <w:sz w:val="26"/>
+          <w:szCs w:val="26"/>
+        </w:rPr>
+      </w:pPr>
+      <w:r>
+        <w:rPr>
+          <w:iCs/>
+          <w:sz w:val="26"/>
+          <w:szCs w:val="26"/>
+        </w:rPr>
+        <w:t>Titre de la communication : Qualité du conseil diététique dans les officines de Cotonou</w:t>
+      </w:r>
+    </w:p>
+    <w:p>
+      <w:pPr>
+        <w:spacing w:line="240" w:lineRule="auto"/>
+        <w:ind w:firstLine="0"/>
+        <w:jc w:val="left"/>
+        <w:rPr>
+          <w:b/>
+          <w:bCs/>
+          <w:i/>
+          <w:iCs/>
+          <w:sz w:val="26"/>
+          <w:szCs w:val="26"/>
+        </w:rPr>
+      </w:pPr>
+      <w:r>
+        <w:rPr>
+          <w:i/>
+          <w:sz w:val="26"/>
+          <w:szCs w:val="26"/>
+        </w:rPr>
+        <w:t xml:space="preserve">In : </w:t>
+      </w:r>
+      <w:sdt>
+        <w:sdtPr>
+          <w:rPr>
+            <w:i/>
+            <w:sz w:val="26"/>
+            <w:szCs w:val="26"/>
+          </w:rPr>
+          <w:id w:val="2041938789"/>
+          <w:placeholder>
+            <w:docPart w:val="6E58297A3137714D9B935301E935CC5D"/>
+          </w:placeholder>
+        </w:sdtPr>
+        <w:sdtContent>
+          <w:r>
+            <w:rPr>
+              <w:iCs/>
+              <w:sz w:val="26"/>
+              <w:szCs w:val="26"/>
+            </w:rPr>
+            <w:t xml:space="preserve">AZANDJEME Colette </w:t>
+          </w:r>
+          <w:proofErr w:type="gramStart"/>
+          <w:r>
+            <w:rPr>
+              <w:iCs/>
+              <w:sz w:val="26"/>
+              <w:szCs w:val="26"/>
+            </w:rPr>
+            <w:t xml:space="preserve">Sylvie </w:t>
+          </w:r>
+          <w:r>
+            <w:rPr>
+              <w:iCs/>
+              <w:sz w:val="26"/>
+              <w:szCs w:val="26"/>
+            </w:rPr>
+            <w:t xml:space="preserve"> </w:t>
+          </w:r>
+          <w:r>
+            <w:rPr>
+              <w:i/>
+              <w:sz w:val="26"/>
+              <w:szCs w:val="26"/>
+            </w:rPr>
+            <w:t>(</w:t>
+          </w:r>
+          <w:proofErr w:type="gramEnd"/>
+          <w:r>
+            <w:rPr>
+              <w:i/>
+              <w:sz w:val="26"/>
+              <w:szCs w:val="26"/>
+            </w:rPr>
+            <w:t>4eme</w:t>
+          </w:r>
+          <w:r>
+            <w:rPr>
+              <w:i/>
+              <w:sz w:val="26"/>
+              <w:szCs w:val="26"/>
+            </w:rPr>
+            <w:t xml:space="preserve">, </w:t>
+          </w:r>
+          <w:r>
+            <w:rPr>
+              <w:i/>
+              <w:sz w:val="26"/>
+              <w:szCs w:val="26"/>
+            </w:rPr>
+            <w:t xml:space="preserve">Institut Régionale de Santé Publique </w:t>
+          </w:r>
+          <w:proofErr w:type="spellStart"/>
+          <w:r>
+            <w:rPr>
+              <w:i/>
+              <w:sz w:val="26"/>
+              <w:szCs w:val="26"/>
+            </w:rPr>
+            <w:t>Comlan</w:t>
+          </w:r>
+          <w:proofErr w:type="spellEnd"/>
+          <w:r>
+            <w:rPr>
+              <w:i/>
+              <w:sz w:val="26"/>
+              <w:szCs w:val="26"/>
+            </w:rPr>
+            <w:t xml:space="preserve"> Alfred </w:t>
+          </w:r>
+          <w:proofErr w:type="spellStart"/>
+          <w:r>
+            <w:rPr>
+              <w:i/>
+              <w:sz w:val="26"/>
+              <w:szCs w:val="26"/>
+            </w:rPr>
+            <w:t>Quenum</w:t>
+          </w:r>
+          <w:proofErr w:type="spellEnd"/>
+          <w:r>
+            <w:rPr>
+              <w:i/>
+              <w:sz w:val="26"/>
+              <w:szCs w:val="26"/>
+            </w:rPr>
+            <w:t xml:space="preserve"> </w:t>
+          </w:r>
+          <w:r>
+            <w:rPr>
+              <w:i/>
+              <w:sz w:val="26"/>
+              <w:szCs w:val="26"/>
+            </w:rPr>
+            <w:t xml:space="preserve">, </w:t>
+          </w:r>
+          <w:r>
+            <w:rPr>
+              <w:i/>
+              <w:sz w:val="26"/>
+              <w:szCs w:val="26"/>
+            </w:rPr>
+            <w:t>3 au 4 décembre 2020</w:t>
+          </w:r>
+          <w:r>
+            <w:rPr>
+              <w:i/>
+              <w:sz w:val="26"/>
+              <w:szCs w:val="26"/>
+            </w:rPr>
+            <w:t>)</w:t>
+          </w:r>
+        </w:sdtContent>
+      </w:sdt>
+      <w:r>
+        <w:rPr>
+          <w:i/>
+        </w:rPr>
+        <w:t>Programme scientifique et résumés des communications, 6èmes Journées Scientifiques de l’IRSP-CAQ (Ouidah, Bénin, 22–26 avril 2025), code CAPH01, p. 163.</w:t>
+      </w:r>
+    </w:p>
+    <w:p>
+      <w:pPr>
+        <w:suppressAutoHyphens/>
+        <w:spacing w:line="240" w:lineRule="auto"/>
+        <w:ind w:right="146" w:firstLine="0"/>
+        <w:rPr>
+          <w:b/>
+          <w:color w:val="000000"/>
+          <w:spacing w:val="-1"/>
+          <w:sz w:val="26"/>
+          <w:szCs w:val="26"/>
+          <w:u w:val="single"/>
+        </w:rPr>
+      </w:pPr>
+      <w:r/>
+    </w:p>
+    <w:p>
+      <w:pPr>
+        <w:spacing w:line="240" w:lineRule="auto"/>
+        <w:ind w:firstLine="0"/>
+        <w:jc w:val="left"/>
+        <w:rPr>
+          <w:iCs/>
+          <w:sz w:val="26"/>
+          <w:szCs w:val="26"/>
+        </w:rPr>
+      </w:pPr>
+      <w:r>
+        <w:rPr>
+          <w:iCs/>
+          <w:sz w:val="26"/>
+          <w:szCs w:val="26"/>
+        </w:rPr>
+        <w:t>Auteurs : Azandjeme Colette Sylvie, Boukari Mama Yassarath, Mizehoun Carmelle, Houssou Gbemahon Roger, Metonnou Clemence, Sossa Charles</w:t>
+      </w:r>
+      <w:r>
+        <w:rPr>
+          <w:iCs/>
+          <w:sz w:val="26"/>
+          <w:szCs w:val="26"/>
+        </w:rPr>
+      </w:r>
+      <w:r>
+        <w:rPr>
+          <w:iCs/>
+          <w:sz w:val="26"/>
+          <w:szCs w:val="26"/>
+        </w:rPr>
+      </w:r>
+    </w:p>
+    <w:p>
+      <w:pPr>
+        <w:spacing w:line="240" w:lineRule="auto"/>
+        <w:ind w:firstLine="0"/>
+        <w:jc w:val="left"/>
+        <w:rPr>
+          <w:iCs/>
+          <w:sz w:val="26"/>
+          <w:szCs w:val="26"/>
+        </w:rPr>
+      </w:pPr>
+      <w:r>
+        <w:rPr>
+          <w:iCs/>
+          <w:sz w:val="26"/>
+          <w:szCs w:val="26"/>
+        </w:rPr>
+        <w:t>Titre de la communication : Qualité du gain pondéral suite à la récupération nutritionnelle chez les enfants malnutris de 06 à 59 mois au CHU-MEL de Cotonou en 2023</w:t>
+      </w:r>
+    </w:p>
+    <w:p>
+      <w:pPr>
+        <w:spacing w:line="240" w:lineRule="auto"/>
+        <w:ind w:firstLine="0"/>
+        <w:jc w:val="left"/>
+        <w:rPr>
+          <w:b/>
+          <w:bCs/>
+          <w:i/>
+          <w:iCs/>
+          <w:sz w:val="26"/>
+          <w:szCs w:val="26"/>
+        </w:rPr>
+      </w:pPr>
+      <w:r>
+        <w:rPr>
+          <w:i/>
+          <w:sz w:val="26"/>
+          <w:szCs w:val="26"/>
+        </w:rPr>
+        <w:t xml:space="preserve">In : </w:t>
+      </w:r>
+      <w:sdt>
+        <w:sdtPr>
+          <w:rPr>
+            <w:i/>
+            <w:sz w:val="26"/>
+            <w:szCs w:val="26"/>
+          </w:rPr>
+          <w:id w:val="2041938789"/>
+          <w:placeholder>
+            <w:docPart w:val="6E58297A3137714D9B935301E935CC5D"/>
+          </w:placeholder>
+        </w:sdtPr>
+        <w:sdtContent>
+          <w:r>
+            <w:rPr>
+              <w:iCs/>
+              <w:sz w:val="26"/>
+              <w:szCs w:val="26"/>
+            </w:rPr>
+            <w:t xml:space="preserve">AZANDJEME Colette </w:t>
+          </w:r>
+          <w:proofErr w:type="gramStart"/>
+          <w:r>
+            <w:rPr>
+              <w:iCs/>
+              <w:sz w:val="26"/>
+              <w:szCs w:val="26"/>
+            </w:rPr>
+            <w:t xml:space="preserve">Sylvie </w:t>
+          </w:r>
+          <w:r>
+            <w:rPr>
+              <w:iCs/>
+              <w:sz w:val="26"/>
+              <w:szCs w:val="26"/>
+            </w:rPr>
+            <w:t xml:space="preserve"> </w:t>
+          </w:r>
+          <w:r>
+            <w:rPr>
+              <w:i/>
+              <w:sz w:val="26"/>
+              <w:szCs w:val="26"/>
+            </w:rPr>
+            <w:t>(</w:t>
+          </w:r>
+          <w:proofErr w:type="gramEnd"/>
+          <w:r>
+            <w:rPr>
+              <w:i/>
+              <w:sz w:val="26"/>
+              <w:szCs w:val="26"/>
+            </w:rPr>
+            <w:t>4eme</w:t>
+          </w:r>
+          <w:r>
+            <w:rPr>
+              <w:i/>
+              <w:sz w:val="26"/>
+              <w:szCs w:val="26"/>
+            </w:rPr>
+            <w:t xml:space="preserve">, </w:t>
+          </w:r>
+          <w:r>
+            <w:rPr>
+              <w:i/>
+              <w:sz w:val="26"/>
+              <w:szCs w:val="26"/>
+            </w:rPr>
+            <w:t xml:space="preserve">Institut Régionale de Santé Publique </w:t>
+          </w:r>
+          <w:proofErr w:type="spellStart"/>
+          <w:r>
+            <w:rPr>
+              <w:i/>
+              <w:sz w:val="26"/>
+              <w:szCs w:val="26"/>
+            </w:rPr>
+            <w:t>Comlan</w:t>
+          </w:r>
+          <w:proofErr w:type="spellEnd"/>
+          <w:r>
+            <w:rPr>
+              <w:i/>
+              <w:sz w:val="26"/>
+              <w:szCs w:val="26"/>
+            </w:rPr>
+            <w:t xml:space="preserve"> Alfred </w:t>
+          </w:r>
+          <w:proofErr w:type="spellStart"/>
+          <w:r>
+            <w:rPr>
+              <w:i/>
+              <w:sz w:val="26"/>
+              <w:szCs w:val="26"/>
+            </w:rPr>
+            <w:t>Quenum</w:t>
+          </w:r>
+          <w:proofErr w:type="spellEnd"/>
+          <w:r>
+            <w:rPr>
+              <w:i/>
+              <w:sz w:val="26"/>
+              <w:szCs w:val="26"/>
+            </w:rPr>
+            <w:t xml:space="preserve"> </w:t>
+          </w:r>
+          <w:r>
+            <w:rPr>
+              <w:i/>
+              <w:sz w:val="26"/>
+              <w:szCs w:val="26"/>
+            </w:rPr>
+            <w:t xml:space="preserve">, </w:t>
+          </w:r>
+          <w:r>
+            <w:rPr>
+              <w:i/>
+              <w:sz w:val="26"/>
+              <w:szCs w:val="26"/>
+            </w:rPr>
+            <w:t>3 au 4 décembre 2020</w:t>
+          </w:r>
+          <w:r>
+            <w:rPr>
+              <w:i/>
+              <w:sz w:val="26"/>
+              <w:szCs w:val="26"/>
+            </w:rPr>
+            <w:t>)</w:t>
+          </w:r>
+        </w:sdtContent>
+      </w:sdt>
+      <w:r>
+        <w:rPr>
+          <w:i/>
+        </w:rPr>
+        <w:t>Programme scientifique et résumés des communications, 6èmes Journées Scientifiques de l’IRSP-CAQ (Ouidah, Bénin, 22–26 avril 2025), code CAPH02, p. 164.</w:t>
+      </w:r>
+    </w:p>
+    <w:p>
+      <w:pPr>
+        <w:suppressAutoHyphens/>
+        <w:spacing w:line="240" w:lineRule="auto"/>
+        <w:ind w:right="146" w:firstLine="0"/>
+        <w:rPr>
+          <w:b/>
+          <w:color w:val="000000"/>
+          <w:spacing w:val="-1"/>
+          <w:sz w:val="26"/>
+          <w:szCs w:val="26"/>
+          <w:u w:val="single"/>
+        </w:rPr>
+      </w:pPr>
+      <w:r/>
+    </w:p>
+    <w:p>
+      <w:pPr>
+        <w:spacing w:line="240" w:lineRule="auto"/>
+        <w:ind w:firstLine="0"/>
+        <w:jc w:val="left"/>
+        <w:rPr>
+          <w:iCs/>
+          <w:sz w:val="26"/>
+          <w:szCs w:val="26"/>
+        </w:rPr>
+      </w:pPr>
+      <w:r>
+        <w:rPr>
+          <w:iCs/>
+          <w:sz w:val="26"/>
+          <w:szCs w:val="26"/>
+        </w:rPr>
+        <w:t>Auteurs : Mongbo Virginie, Weke Gildas Yélian, Tokoudagba Jean-Marie, Azandjeme Colette, Charles Sossa-Jerome</w:t>
+      </w:r>
+      <w:r>
+        <w:rPr>
+          <w:iCs/>
+          <w:sz w:val="26"/>
+          <w:szCs w:val="26"/>
+        </w:rPr>
+      </w:r>
+      <w:r>
+        <w:rPr>
+          <w:iCs/>
+          <w:sz w:val="26"/>
+          <w:szCs w:val="26"/>
+        </w:rPr>
+      </w:r>
+    </w:p>
+    <w:p>
+      <w:pPr>
+        <w:spacing w:line="240" w:lineRule="auto"/>
+        <w:ind w:firstLine="0"/>
+        <w:jc w:val="left"/>
+        <w:rPr>
+          <w:iCs/>
+          <w:sz w:val="26"/>
+          <w:szCs w:val="26"/>
+        </w:rPr>
+      </w:pPr>
+      <w:r>
+        <w:rPr>
+          <w:iCs/>
+          <w:sz w:val="26"/>
+          <w:szCs w:val="26"/>
+        </w:rPr>
+        <w:t>Titre de la communication : Analyse des prescriptions médicamenteuses reçues dans des officines de pharmacie privées de la commune d’Abomey-Calavi au Bénin</w:t>
+      </w:r>
+    </w:p>
+    <w:p>
+      <w:pPr>
+        <w:spacing w:line="240" w:lineRule="auto"/>
+        <w:ind w:firstLine="0"/>
+        <w:jc w:val="left"/>
+        <w:rPr>
+          <w:b/>
+          <w:bCs/>
+          <w:i/>
+          <w:iCs/>
+          <w:sz w:val="26"/>
+          <w:szCs w:val="26"/>
+        </w:rPr>
+      </w:pPr>
+      <w:r>
+        <w:rPr>
+          <w:i/>
+          <w:sz w:val="26"/>
+          <w:szCs w:val="26"/>
+        </w:rPr>
+        <w:t xml:space="preserve">In : </w:t>
+      </w:r>
+      <w:sdt>
+        <w:sdtPr>
+          <w:rPr>
+            <w:i/>
+            <w:sz w:val="26"/>
+            <w:szCs w:val="26"/>
+          </w:rPr>
+          <w:id w:val="2041938789"/>
+          <w:placeholder>
+            <w:docPart w:val="6E58297A3137714D9B935301E935CC5D"/>
+          </w:placeholder>
+        </w:sdtPr>
+        <w:sdtContent>
+          <w:r>
+            <w:rPr>
+              <w:iCs/>
+              <w:sz w:val="26"/>
+              <w:szCs w:val="26"/>
+            </w:rPr>
+            <w:t xml:space="preserve">AZANDJEME Colette </w:t>
+          </w:r>
+          <w:proofErr w:type="gramStart"/>
+          <w:r>
+            <w:rPr>
+              <w:iCs/>
+              <w:sz w:val="26"/>
+              <w:szCs w:val="26"/>
+            </w:rPr>
+            <w:t xml:space="preserve">Sylvie </w:t>
+          </w:r>
+          <w:r>
+            <w:rPr>
+              <w:iCs/>
+              <w:sz w:val="26"/>
+              <w:szCs w:val="26"/>
+            </w:rPr>
+            <w:t xml:space="preserve"> </w:t>
+          </w:r>
+          <w:r>
+            <w:rPr>
+              <w:i/>
+              <w:sz w:val="26"/>
+              <w:szCs w:val="26"/>
+            </w:rPr>
+            <w:t>(</w:t>
+          </w:r>
+          <w:proofErr w:type="gramEnd"/>
+          <w:r>
+            <w:rPr>
+              <w:i/>
+              <w:sz w:val="26"/>
+              <w:szCs w:val="26"/>
+            </w:rPr>
+            <w:t>4eme</w:t>
+          </w:r>
+          <w:r>
+            <w:rPr>
+              <w:i/>
+              <w:sz w:val="26"/>
+              <w:szCs w:val="26"/>
+            </w:rPr>
+            <w:t xml:space="preserve">, </w:t>
+          </w:r>
+          <w:r>
+            <w:rPr>
+              <w:i/>
+              <w:sz w:val="26"/>
+              <w:szCs w:val="26"/>
+            </w:rPr>
+            <w:t xml:space="preserve">Institut Régionale de Santé Publique </w:t>
+          </w:r>
+          <w:proofErr w:type="spellStart"/>
+          <w:r>
+            <w:rPr>
+              <w:i/>
+              <w:sz w:val="26"/>
+              <w:szCs w:val="26"/>
+            </w:rPr>
+            <w:t>Comlan</w:t>
+          </w:r>
+          <w:proofErr w:type="spellEnd"/>
+          <w:r>
+            <w:rPr>
+              <w:i/>
+              <w:sz w:val="26"/>
+              <w:szCs w:val="26"/>
+            </w:rPr>
+            <w:t xml:space="preserve"> Alfred </w:t>
+          </w:r>
+          <w:proofErr w:type="spellStart"/>
+          <w:r>
+            <w:rPr>
+              <w:i/>
+              <w:sz w:val="26"/>
+              <w:szCs w:val="26"/>
+            </w:rPr>
+            <w:t>Quenum</w:t>
+          </w:r>
+          <w:proofErr w:type="spellEnd"/>
+          <w:r>
+            <w:rPr>
+              <w:i/>
+              <w:sz w:val="26"/>
+              <w:szCs w:val="26"/>
+            </w:rPr>
+            <w:t xml:space="preserve"> </w:t>
+          </w:r>
+          <w:r>
+            <w:rPr>
+              <w:i/>
+              <w:sz w:val="26"/>
+              <w:szCs w:val="26"/>
+            </w:rPr>
+            <w:t xml:space="preserve">, </w:t>
+          </w:r>
+          <w:r>
+            <w:rPr>
+              <w:i/>
+              <w:sz w:val="26"/>
+              <w:szCs w:val="26"/>
+            </w:rPr>
+            <w:t>3 au 4 décembre 2020</w:t>
+          </w:r>
+          <w:r>
+            <w:rPr>
+              <w:i/>
+              <w:sz w:val="26"/>
+              <w:szCs w:val="26"/>
+            </w:rPr>
+            <w:t>)</w:t>
+          </w:r>
+        </w:sdtContent>
+      </w:sdt>
+      <w:r>
+        <w:rPr>
+          <w:i/>
+        </w:rPr>
+        <w:t>Programme scientifique et résumés des communications, 6èmes Journées Scientifiques de l’IRSP-CAQ (Ouidah, Bénin, 22–26 avril 2025), code CACL01, p. 167.</w:t>
+      </w:r>
+    </w:p>
+    <w:p>
+      <w:pPr>
+        <w:suppressAutoHyphens/>
+        <w:spacing w:line="240" w:lineRule="auto"/>
+        <w:ind w:right="146" w:firstLine="0"/>
+        <w:rPr>
+          <w:b/>
+          <w:color w:val="000000"/>
+          <w:spacing w:val="-1"/>
+          <w:sz w:val="26"/>
+          <w:szCs w:val="26"/>
+          <w:u w:val="single"/>
+        </w:rPr>
+      </w:pPr>
+      <w:r/>
     </w:p>
     <w:p>
       <w:pPr>

</xml_diff>